<commit_message>
Improve booking fields and Word form layout
</commit_message>
<xml_diff>
--- a/frontend/public/documents/reservation-template.docx
+++ b/frontend/public/documents/reservation-template.docx
@@ -1106,7 +1106,7 @@
       </w:tblGrid>
       <w:tr>
         <w:trPr>
-          <w:trHeight w:val="235"/>
+          <w:trHeight w:val="235" w:hRule="atLeast"/>
         </w:trPr>
         <w:tc>
           <w:tcPr>
@@ -1115,7 +1115,7 @@
           <w:p>
             <w:pPr>
               <w:pStyle w:val="TableParagraph"/>
-              <w:spacing w:line="201" w:lineRule="exact"/>
+              <w:spacing/>
               <w:ind w:left="50"/>
               <w:rPr>
                 <w:sz w:val="18"/>
@@ -1170,7 +1170,7 @@
           <w:p>
             <w:pPr>
               <w:pStyle w:val="TableParagraph"/>
-              <w:spacing w:line="201" w:lineRule="exact"/>
+              <w:spacing/>
               <w:ind w:left="133"/>
               <w:rPr>
                 <w:sz w:val="18"/>
@@ -1215,7 +1215,7 @@
       </w:tr>
       <w:tr>
         <w:trPr>
-          <w:trHeight w:val="235"/>
+          <w:trHeight w:val="235" w:hRule="atLeast"/>
         </w:trPr>
         <w:tc>
           <w:tcPr>
@@ -1224,7 +1224,7 @@
           <w:p>
             <w:pPr>
               <w:pStyle w:val="TableParagraph"/>
-              <w:spacing w:before="28" w:line="188" w:lineRule="exact"/>
+              <w:spacing w:before="28"/>
               <w:ind w:left="50"/>
               <w:rPr>
                 <w:sz w:val="18"/>
@@ -1299,7 +1299,7 @@
           <w:p>
             <w:pPr>
               <w:pStyle w:val="TableParagraph"/>
-              <w:spacing w:before="28" w:line="188" w:lineRule="exact"/>
+              <w:spacing w:before="28"/>
               <w:ind w:left="133"/>
               <w:rPr>
                 <w:sz w:val="18"/>
@@ -1351,6 +1351,13 @@
           <w:sz w:val="13"/>
         </w:rPr>
       </w:pPr>
+      <w:r>
+        <w:rPr>
+          <w:rFonts w:ascii="Times New Roman" w:hAnsi="Times New Roman"/>
+          <w:sz w:val="16"/>
+        </w:rPr>
+        <w:t>{{CONTACT_DETAILS}}</w:t>
+      </w:r>
     </w:p>
     <w:tbl>
       <w:tblPr>
@@ -1383,7 +1390,7 @@
       </w:tblGrid>
       <w:tr>
         <w:trPr>
-          <w:trHeight w:val="204"/>
+          <w:trHeight w:val="204" w:hRule="atLeast"/>
         </w:trPr>
         <w:tc>
           <w:tcPr>
@@ -1477,7 +1484,7 @@
           <w:p>
             <w:pPr>
               <w:pStyle w:val="TableParagraph"/>
-              <w:spacing w:before="35" w:line="149" w:lineRule="exact"/>
+              <w:spacing w:before="35"/>
               <w:ind w:left="1587"/>
               <w:rPr>
                 <w:rFonts w:ascii="Arial"/>
@@ -1609,7 +1616,7 @@
       </w:tr>
       <w:tr>
         <w:trPr>
-          <w:trHeight w:val="205"/>
+          <w:trHeight w:val="205" w:hRule="atLeast"/>
         </w:trPr>
         <w:tc>
           <w:tcPr>
@@ -1659,7 +1666,7 @@
           <w:p>
             <w:pPr>
               <w:pStyle w:val="TableParagraph"/>
-              <w:spacing w:before="8" w:line="176" w:lineRule="exact"/>
+              <w:spacing w:before="8"/>
               <w:ind w:left="562"/>
               <w:rPr>
                 <w:rFonts w:ascii="Arial"/>
@@ -1745,7 +1752,7 @@
           <w:p>
             <w:pPr>
               <w:pStyle w:val="TableParagraph"/>
-              <w:spacing w:before="1" w:line="184" w:lineRule="exact"/>
+              <w:spacing w:before="1"/>
               <w:ind w:left="849"/>
               <w:rPr>
                 <w:rFonts w:ascii="Arial"/>
@@ -1767,7 +1774,7 @@
       </w:tr>
       <w:tr>
         <w:trPr>
-          <w:trHeight w:val="315"/>
+          <w:trHeight w:val="315" w:hRule="atLeast"/>
         </w:trPr>
         <w:tc>
           <w:tcPr>
@@ -1893,7 +1900,7 @@
           <w:p>
             <w:pPr>
               <w:pStyle w:val="TableParagraph"/>
-              <w:spacing w:line="160" w:lineRule="atLeast"/>
+              <w:spacing/>
               <w:ind w:left="182" w:right="150" w:firstLine="38"/>
               <w:rPr>
                 <w:rFonts w:ascii="Arial"/>
@@ -1994,7 +2001,7 @@
       </w:tr>
       <w:tr>
         <w:trPr>
-          <w:trHeight w:val="250"/>
+          <w:trHeight w:val="250" w:hRule="atLeast"/>
         </w:trPr>
         <w:tc>
           <w:tcPr>

</xml_diff>

<commit_message>
Fix utilization form layout and downloads
</commit_message>
<xml_diff>
--- a/frontend/public/documents/reservation-template.docx
+++ b/frontend/public/documents/reservation-template.docx
@@ -60,42 +60,14 @@
     </w:p>
     <w:p>
       <w:pPr>
-        <w:pStyle w:val="BodyText"/>
-        <w:tabs>
-          <w:tab w:val="left" w:pos="1799"/>
-          <w:tab w:val="left" w:pos="4181"/>
-        </w:tabs>
-        <w:spacing w:before="243"/>
-        <w:ind w:left="350"/>
-        <w:rPr>
-          <w:rFonts w:ascii="Times New Roman"/>
-        </w:rPr>
+        <w:spacing w:before="40" w:after="40" w:line="240" w:lineRule="auto"/>
       </w:pPr>
       <w:r>
-        <w:t xml:space="preserve">Date of </w:t>
-      </w:r>
-      <w:r>
-        <w:rPr>
-          <w:spacing w:val="-2"/>
-        </w:rPr>
-        <w:t>Filed:</w:t>
-      </w:r>
-      <w:r>
-        <w:tab/>
-      </w:r>
-      <w:r>
-        <w:rPr>
-          <w:rFonts w:ascii="Times New Roman"/>
-          <w:u w:val="thick"/>
-        </w:rPr>
-        <w:tab/>
-      </w:r>
-      <w:r>
-        <w:rPr>
-          <w:rFonts w:ascii="Times New Roman" w:hAnsi="Times New Roman"/>
-          <w:sz w:val="18"/>
-        </w:rPr>
-        <w:t> {{FILED_DATE}}</w:t>
+        <w:rPr>
+          <w:rFonts w:ascii="Arial" w:hAnsi="Arial"/>
+          <w:sz w:val="20"/>
+        </w:rPr>
+        <w:t>Date filed: {{FILED_DATE}}</w:t>
       </w:r>
     </w:p>
     <w:p>
@@ -736,346 +708,15 @@
     </w:p>
     <w:p>
       <w:pPr>
-        <w:pStyle w:val="BodyText"/>
-        <w:tabs>
-          <w:tab w:val="left" w:pos="1511"/>
-          <w:tab w:val="left" w:pos="3296"/>
-          <w:tab w:val="left" w:pos="5351"/>
-          <w:tab w:val="left" w:pos="7241"/>
-          <w:tab w:val="left" w:pos="8921"/>
-        </w:tabs>
-        <w:spacing w:before="169"/>
-        <w:ind w:left="41"/>
-        <w:jc w:val="center"/>
+        <w:spacing w:before="40" w:after="40" w:line="240" w:lineRule="auto"/>
       </w:pPr>
       <w:r>
         <w:rPr>
-          <w:noProof/>
-          <w:position w:val="2"/>
-        </w:rPr>
-        <w:drawing>
-          <wp:inline distT="0" distB="0" distL="0" distR="0" wp14:anchorId="3100D341" wp14:editId="07B541C1">
-            <wp:extent cx="152400" cy="161925"/>
-            <wp:effectExtent l="0" t="0" r="0" b="0"/>
-            <wp:docPr id="7" name="Image 7"/>
-            <wp:cNvGraphicFramePr>
-              <a:graphicFrameLocks xmlns:a="http://schemas.openxmlformats.org/drawingml/2006/main"/>
-            </wp:cNvGraphicFramePr>
-            <a:graphic xmlns:a="http://schemas.openxmlformats.org/drawingml/2006/main">
-              <a:graphicData uri="http://schemas.openxmlformats.org/drawingml/2006/picture">
-                <pic:pic xmlns:pic="http://schemas.openxmlformats.org/drawingml/2006/picture">
-                  <pic:nvPicPr>
-                    <pic:cNvPr id="7" name="Image 7"/>
-                    <pic:cNvPicPr/>
-                  </pic:nvPicPr>
-                  <pic:blipFill>
-                    <a:blip r:embed="rId7" cstate="print"/>
-                    <a:stretch>
-                      <a:fillRect/>
-                    </a:stretch>
-                  </pic:blipFill>
-                  <pic:spPr>
-                    <a:xfrm>
-                      <a:off x="0" y="0"/>
-                      <a:ext cx="152400" cy="161925"/>
-                    </a:xfrm>
-                    <a:prstGeom prst="rect">
-                      <a:avLst/>
-                    </a:prstGeom>
-                  </pic:spPr>
-                </pic:pic>
-              </a:graphicData>
-            </a:graphic>
-          </wp:inline>
-        </w:drawing>
-      </w:r>
-      <w:r>
-        <w:rPr>
-          <w:rFonts w:ascii="Times New Roman"/>
-          <w:spacing w:val="80"/>
+          <w:rFonts w:ascii="Arial" w:hAnsi="Arial"/>
           <w:sz w:val="20"/>
-        </w:rPr>
-        <w:t xml:space="preserve"> </w:t>
-      </w:r>
-      <w:r>
-        <w:t>Bar Area</w:t>
-      </w:r>
-      <w:r>
-        <w:tab/>
-      </w:r>
-      <w:r>
-        <w:rPr>
-          <w:noProof/>
-          <w:position w:val="2"/>
-        </w:rPr>
-        <w:drawing>
-          <wp:inline distT="0" distB="0" distL="0" distR="0" wp14:anchorId="4FA8341F" wp14:editId="02E46D25">
-            <wp:extent cx="152400" cy="161925"/>
-            <wp:effectExtent l="0" t="0" r="0" b="0"/>
-            <wp:docPr id="8" name="Image 8"/>
-            <wp:cNvGraphicFramePr>
-              <a:graphicFrameLocks xmlns:a="http://schemas.openxmlformats.org/drawingml/2006/main"/>
-            </wp:cNvGraphicFramePr>
-            <a:graphic xmlns:a="http://schemas.openxmlformats.org/drawingml/2006/main">
-              <a:graphicData uri="http://schemas.openxmlformats.org/drawingml/2006/picture">
-                <pic:pic xmlns:pic="http://schemas.openxmlformats.org/drawingml/2006/picture">
-                  <pic:nvPicPr>
-                    <pic:cNvPr id="8" name="Image 8"/>
-                    <pic:cNvPicPr/>
-                  </pic:nvPicPr>
-                  <pic:blipFill>
-                    <a:blip r:embed="rId7" cstate="print"/>
-                    <a:stretch>
-                      <a:fillRect/>
-                    </a:stretch>
-                  </pic:blipFill>
-                  <pic:spPr>
-                    <a:xfrm>
-                      <a:off x="0" y="0"/>
-                      <a:ext cx="152400" cy="161925"/>
-                    </a:xfrm>
-                    <a:prstGeom prst="rect">
-                      <a:avLst/>
-                    </a:prstGeom>
-                  </pic:spPr>
-                </pic:pic>
-              </a:graphicData>
-            </a:graphic>
-          </wp:inline>
-        </w:drawing>
-      </w:r>
-      <w:r>
-        <w:rPr>
-          <w:rFonts w:ascii="Times New Roman"/>
-          <w:spacing w:val="80"/>
-        </w:rPr>
-        <w:t xml:space="preserve"> </w:t>
-      </w:r>
-      <w:r>
-        <w:t>Dining Area</w:t>
-      </w:r>
-      <w:r>
-        <w:tab/>
-      </w:r>
-      <w:r>
-        <w:rPr>
-          <w:noProof/>
-        </w:rPr>
-        <w:drawing>
-          <wp:inline distT="0" distB="0" distL="0" distR="0" wp14:anchorId="103BDCCA" wp14:editId="6391FBA3">
-            <wp:extent cx="152400" cy="161925"/>
-            <wp:effectExtent l="0" t="0" r="0" b="0"/>
-            <wp:docPr id="9" name="Image 9"/>
-            <wp:cNvGraphicFramePr>
-              <a:graphicFrameLocks xmlns:a="http://schemas.openxmlformats.org/drawingml/2006/main"/>
-            </wp:cNvGraphicFramePr>
-            <a:graphic xmlns:a="http://schemas.openxmlformats.org/drawingml/2006/main">
-              <a:graphicData uri="http://schemas.openxmlformats.org/drawingml/2006/picture">
-                <pic:pic xmlns:pic="http://schemas.openxmlformats.org/drawingml/2006/picture">
-                  <pic:nvPicPr>
-                    <pic:cNvPr id="9" name="Image 9"/>
-                    <pic:cNvPicPr/>
-                  </pic:nvPicPr>
-                  <pic:blipFill>
-                    <a:blip r:embed="rId7" cstate="print"/>
-                    <a:stretch>
-                      <a:fillRect/>
-                    </a:stretch>
-                  </pic:blipFill>
-                  <pic:spPr>
-                    <a:xfrm>
-                      <a:off x="0" y="0"/>
-                      <a:ext cx="152400" cy="161925"/>
-                    </a:xfrm>
-                    <a:prstGeom prst="rect">
-                      <a:avLst/>
-                    </a:prstGeom>
-                  </pic:spPr>
-                </pic:pic>
-              </a:graphicData>
-            </a:graphic>
-          </wp:inline>
-        </w:drawing>
-      </w:r>
-      <w:r>
-        <w:rPr>
-          <w:rFonts w:ascii="Times New Roman"/>
-          <w:spacing w:val="40"/>
-        </w:rPr>
-        <w:t xml:space="preserve"> </w:t>
-      </w:r>
-      <w:r>
-        <w:t>Front Office Area</w:t>
-      </w:r>
-      <w:r>
-        <w:tab/>
-      </w:r>
-      <w:r>
-        <w:rPr>
-          <w:noProof/>
-        </w:rPr>
-        <w:drawing>
-          <wp:inline distT="0" distB="0" distL="0" distR="0" wp14:anchorId="726F8D47" wp14:editId="3C8BE0AB">
-            <wp:extent cx="152400" cy="161925"/>
-            <wp:effectExtent l="0" t="0" r="0" b="0"/>
-            <wp:docPr id="10" name="Image 10"/>
-            <wp:cNvGraphicFramePr>
-              <a:graphicFrameLocks xmlns:a="http://schemas.openxmlformats.org/drawingml/2006/main"/>
-            </wp:cNvGraphicFramePr>
-            <a:graphic xmlns:a="http://schemas.openxmlformats.org/drawingml/2006/main">
-              <a:graphicData uri="http://schemas.openxmlformats.org/drawingml/2006/picture">
-                <pic:pic xmlns:pic="http://schemas.openxmlformats.org/drawingml/2006/picture">
-                  <pic:nvPicPr>
-                    <pic:cNvPr id="10" name="Image 10"/>
-                    <pic:cNvPicPr/>
-                  </pic:nvPicPr>
-                  <pic:blipFill>
-                    <a:blip r:embed="rId7" cstate="print"/>
-                    <a:stretch>
-                      <a:fillRect/>
-                    </a:stretch>
-                  </pic:blipFill>
-                  <pic:spPr>
-                    <a:xfrm>
-                      <a:off x="0" y="0"/>
-                      <a:ext cx="152400" cy="161925"/>
-                    </a:xfrm>
-                    <a:prstGeom prst="rect">
-                      <a:avLst/>
-                    </a:prstGeom>
-                  </pic:spPr>
-                </pic:pic>
-              </a:graphicData>
-            </a:graphic>
-          </wp:inline>
-        </w:drawing>
-      </w:r>
-      <w:r>
-        <w:rPr>
-          <w:rFonts w:ascii="Times New Roman"/>
-          <w:spacing w:val="80"/>
-        </w:rPr>
-        <w:t xml:space="preserve"> </w:t>
-      </w:r>
-      <w:r>
-        <w:t>Kitchen</w:t>
-      </w:r>
-      <w:r>
-        <w:rPr>
-          <w:spacing w:val="40"/>
-        </w:rPr>
-        <w:t xml:space="preserve"> </w:t>
-      </w:r>
-      <w:r>
-        <w:t>Area</w:t>
-      </w:r>
-      <w:r>
-        <w:tab/>
-      </w:r>
-      <w:r>
-        <w:rPr>
-          <w:noProof/>
-        </w:rPr>
-        <w:drawing>
-          <wp:inline distT="0" distB="0" distL="0" distR="0" wp14:anchorId="5D36CDF8" wp14:editId="1A8898BC">
-            <wp:extent cx="152400" cy="161925"/>
-            <wp:effectExtent l="0" t="0" r="0" b="0"/>
-            <wp:docPr id="11" name="Image 11"/>
-            <wp:cNvGraphicFramePr>
-              <a:graphicFrameLocks xmlns:a="http://schemas.openxmlformats.org/drawingml/2006/main"/>
-            </wp:cNvGraphicFramePr>
-            <a:graphic xmlns:a="http://schemas.openxmlformats.org/drawingml/2006/main">
-              <a:graphicData uri="http://schemas.openxmlformats.org/drawingml/2006/picture">
-                <pic:pic xmlns:pic="http://schemas.openxmlformats.org/drawingml/2006/picture">
-                  <pic:nvPicPr>
-                    <pic:cNvPr id="11" name="Image 11"/>
-                    <pic:cNvPicPr/>
-                  </pic:nvPicPr>
-                  <pic:blipFill>
-                    <a:blip r:embed="rId7" cstate="print"/>
-                    <a:stretch>
-                      <a:fillRect/>
-                    </a:stretch>
-                  </pic:blipFill>
-                  <pic:spPr>
-                    <a:xfrm>
-                      <a:off x="0" y="0"/>
-                      <a:ext cx="152400" cy="161925"/>
-                    </a:xfrm>
-                    <a:prstGeom prst="rect">
-                      <a:avLst/>
-                    </a:prstGeom>
-                  </pic:spPr>
-                </pic:pic>
-              </a:graphicData>
-            </a:graphic>
-          </wp:inline>
-        </w:drawing>
-      </w:r>
-      <w:r>
-        <w:rPr>
-          <w:rFonts w:ascii="Times New Roman"/>
-          <w:spacing w:val="40"/>
-        </w:rPr>
-        <w:t xml:space="preserve"> </w:t>
-      </w:r>
-      <w:r>
-        <w:t>Laundry Area</w:t>
-      </w:r>
-      <w:r>
-        <w:tab/>
-      </w:r>
-      <w:r>
-        <w:rPr>
-          <w:noProof/>
-          <w:position w:val="2"/>
-        </w:rPr>
-        <w:drawing>
-          <wp:inline distT="0" distB="0" distL="0" distR="0" wp14:anchorId="05581E85" wp14:editId="20978CF7">
-            <wp:extent cx="152400" cy="161925"/>
-            <wp:effectExtent l="0" t="0" r="0" b="0"/>
-            <wp:docPr id="12" name="Image 12"/>
-            <wp:cNvGraphicFramePr>
-              <a:graphicFrameLocks xmlns:a="http://schemas.openxmlformats.org/drawingml/2006/main"/>
-            </wp:cNvGraphicFramePr>
-            <a:graphic xmlns:a="http://schemas.openxmlformats.org/drawingml/2006/main">
-              <a:graphicData uri="http://schemas.openxmlformats.org/drawingml/2006/picture">
-                <pic:pic xmlns:pic="http://schemas.openxmlformats.org/drawingml/2006/picture">
-                  <pic:nvPicPr>
-                    <pic:cNvPr id="12" name="Image 12"/>
-                    <pic:cNvPicPr/>
-                  </pic:nvPicPr>
-                  <pic:blipFill>
-                    <a:blip r:embed="rId7" cstate="print"/>
-                    <a:stretch>
-                      <a:fillRect/>
-                    </a:stretch>
-                  </pic:blipFill>
-                  <pic:spPr>
-                    <a:xfrm>
-                      <a:off x="0" y="0"/>
-                      <a:ext cx="152400" cy="161925"/>
-                    </a:xfrm>
-                    <a:prstGeom prst="rect">
-                      <a:avLst/>
-                    </a:prstGeom>
-                  </pic:spPr>
-                </pic:pic>
-              </a:graphicData>
-            </a:graphic>
-          </wp:inline>
-        </w:drawing>
-      </w:r>
-      <w:r>
-        <w:rPr>
-          <w:rFonts w:ascii="Times New Roman"/>
-          <w:spacing w:val="80"/>
-          <w:w w:val="150"/>
-        </w:rPr>
-        <w:t xml:space="preserve"> </w:t>
-      </w:r>
-      <w:r>
-        <w:t>Rooms</w:t>
+          <w:b/>
+        </w:rPr>
+        <w:t>Facility / laboratory: {{FACILITY}}</w:t>
       </w:r>
     </w:p>
     <w:p>
@@ -1107,6 +748,7 @@
       <w:tr>
         <w:trPr>
           <w:trHeight w:val="235" w:hRule="atLeast"/>
+          <w:cantSplit/>
         </w:trPr>
         <w:tc>
           <w:tcPr>
@@ -1115,11 +757,10 @@
           <w:p>
             <w:pPr>
               <w:pStyle w:val="TableParagraph"/>
-              <w:spacing/>
-              <w:ind w:left="50"/>
-              <w:rPr>
-                <w:sz w:val="18"/>
-              </w:rPr>
+              <w:rPr>
+                <w:sz w:val="18"/>
+              </w:rPr>
+              <w:spacing w:before="30" w:after="30" w:line="240" w:lineRule="auto"/>
             </w:pPr>
             <w:r>
               <w:rPr>
@@ -1146,18 +787,16 @@
               <w:tabs>
                 <w:tab w:val="left" w:pos="2401"/>
               </w:tabs>
-              <w:spacing/>
-              <w:ind w:left="20"/>
-              <w:jc w:val="center"/>
               <w:rPr>
                 <w:rFonts w:ascii="Times New Roman"/>
                 <w:sz w:val="18"/>
               </w:rPr>
+              <w:spacing w:before="30" w:after="30" w:line="240" w:lineRule="auto"/>
             </w:pPr>
             <w:r>
               <w:rPr>
                 <w:rFonts w:ascii="Times New Roman" w:hAnsi="Times New Roman"/>
-                <w:sz w:val="18"/>
+                <w:sz w:val="20"/>
               </w:rPr>
               <w:t>{{USAGE_DATE}}</w:t>
             </w:r>
@@ -1170,11 +809,10 @@
           <w:p>
             <w:pPr>
               <w:pStyle w:val="TableParagraph"/>
-              <w:spacing/>
-              <w:ind w:left="133"/>
-              <w:rPr>
-                <w:sz w:val="18"/>
-              </w:rPr>
+              <w:rPr>
+                <w:sz w:val="18"/>
+              </w:rPr>
+              <w:spacing w:before="30" w:after="30" w:line="240" w:lineRule="auto"/>
             </w:pPr>
             <w:r>
               <w:rPr>
@@ -1195,18 +833,16 @@
               <w:tabs>
                 <w:tab w:val="left" w:pos="5361"/>
               </w:tabs>
-              <w:spacing/>
-              <w:ind w:right="45"/>
-              <w:jc w:val="right"/>
               <w:rPr>
                 <w:rFonts w:ascii="Times New Roman"/>
                 <w:sz w:val="18"/>
               </w:rPr>
+              <w:spacing w:before="30" w:after="30" w:line="240" w:lineRule="auto"/>
             </w:pPr>
             <w:r>
               <w:rPr>
                 <w:rFonts w:ascii="Times New Roman" w:hAnsi="Times New Roman"/>
-                <w:sz w:val="18"/>
+                <w:sz w:val="20"/>
               </w:rPr>
               <w:t>{{SUBJECT}}</w:t>
             </w:r>
@@ -1216,6 +852,7 @@
       <w:tr>
         <w:trPr>
           <w:trHeight w:val="235" w:hRule="atLeast"/>
+          <w:cantSplit/>
         </w:trPr>
         <w:tc>
           <w:tcPr>
@@ -1224,11 +861,10 @@
           <w:p>
             <w:pPr>
               <w:pStyle w:val="TableParagraph"/>
-              <w:spacing w:before="28"/>
-              <w:ind w:left="50"/>
-              <w:rPr>
-                <w:sz w:val="18"/>
-              </w:rPr>
+              <w:rPr>
+                <w:sz w:val="18"/>
+              </w:rPr>
+              <w:spacing w:before="30" w:after="30" w:line="240" w:lineRule="auto"/>
             </w:pPr>
             <w:r>
               <w:rPr>
@@ -1275,18 +911,16 @@
               <w:tabs>
                 <w:tab w:val="left" w:pos="2401"/>
               </w:tabs>
-              <w:spacing w:before="29"/>
-              <w:ind w:left="20"/>
-              <w:jc w:val="center"/>
               <w:rPr>
                 <w:rFonts w:ascii="Times New Roman"/>
                 <w:sz w:val="18"/>
               </w:rPr>
+              <w:spacing w:before="30" w:after="30" w:line="240" w:lineRule="auto"/>
             </w:pPr>
             <w:r>
               <w:rPr>
                 <w:rFonts w:ascii="Times New Roman" w:hAnsi="Times New Roman"/>
-                <w:sz w:val="18"/>
+                <w:sz w:val="20"/>
               </w:rPr>
               <w:t>{{USAGE_TIME}}</w:t>
             </w:r>
@@ -1299,11 +933,10 @@
           <w:p>
             <w:pPr>
               <w:pStyle w:val="TableParagraph"/>
-              <w:spacing w:before="28"/>
-              <w:ind w:left="133"/>
-              <w:rPr>
-                <w:sz w:val="18"/>
-              </w:rPr>
+              <w:rPr>
+                <w:sz w:val="18"/>
+              </w:rPr>
+              <w:spacing w:before="30" w:after="30" w:line="240" w:lineRule="auto"/>
             </w:pPr>
             <w:r>
               <w:rPr>
@@ -1324,18 +957,16 @@
               <w:tabs>
                 <w:tab w:val="left" w:pos="5361"/>
               </w:tabs>
-              <w:spacing w:before="29"/>
-              <w:ind w:right="45"/>
-              <w:jc w:val="right"/>
               <w:rPr>
                 <w:rFonts w:ascii="Times New Roman"/>
                 <w:sz w:val="18"/>
               </w:rPr>
+              <w:spacing w:before="30" w:after="30" w:line="240" w:lineRule="auto"/>
             </w:pPr>
             <w:r>
               <w:rPr>
                 <w:rFonts w:ascii="Times New Roman" w:hAnsi="Times New Roman"/>
-                <w:sz w:val="18"/>
+                <w:sz w:val="20"/>
               </w:rPr>
               <w:t>{{PURPOSE}}</w:t>
             </w:r>
@@ -1391,6 +1022,8 @@
       <w:tr>
         <w:trPr>
           <w:trHeight w:val="204" w:hRule="atLeast"/>
+          <w:cantSplit/>
+          <w:tblHeader/>
         </w:trPr>
         <w:tc>
           <w:tcPr>
@@ -1401,21 +1034,21 @@
           <w:p>
             <w:pPr>
               <w:pStyle w:val="TableParagraph"/>
-              <w:spacing w:before="8"/>
               <w:rPr>
                 <w:sz w:val="26"/>
               </w:rPr>
+              <w:spacing w:before="30" w:after="30" w:line="240" w:lineRule="auto"/>
             </w:pPr>
           </w:p>
           <w:p>
             <w:pPr>
               <w:pStyle w:val="TableParagraph"/>
-              <w:ind w:left="107"/>
               <w:rPr>
                 <w:rFonts w:ascii="Arial"/>
                 <w:b/>
                 <w:sz w:val="18"/>
               </w:rPr>
+              <w:spacing w:before="30" w:after="30" w:line="240" w:lineRule="auto"/>
             </w:pPr>
             <w:r>
               <w:rPr>
@@ -1437,21 +1070,21 @@
           <w:p>
             <w:pPr>
               <w:pStyle w:val="TableParagraph"/>
-              <w:spacing w:before="8"/>
               <w:rPr>
                 <w:sz w:val="26"/>
               </w:rPr>
+              <w:spacing w:before="30" w:after="30" w:line="240" w:lineRule="auto"/>
             </w:pPr>
           </w:p>
           <w:p>
             <w:pPr>
               <w:pStyle w:val="TableParagraph"/>
-              <w:ind w:left="287"/>
               <w:rPr>
                 <w:rFonts w:ascii="Arial"/>
                 <w:b/>
                 <w:sz w:val="18"/>
               </w:rPr>
+              <w:spacing w:before="30" w:after="30" w:line="240" w:lineRule="auto"/>
             </w:pPr>
             <w:r>
               <w:rPr>
@@ -1484,13 +1117,12 @@
           <w:p>
             <w:pPr>
               <w:pStyle w:val="TableParagraph"/>
-              <w:spacing w:before="35"/>
-              <w:ind w:left="1587"/>
               <w:rPr>
                 <w:rFonts w:ascii="Arial"/>
                 <w:i/>
                 <w:sz w:val="14"/>
               </w:rPr>
+              <w:spacing w:before="30" w:after="30" w:line="240" w:lineRule="auto"/>
             </w:pPr>
             <w:r>
               <w:rPr>
@@ -1617,6 +1249,8 @@
       <w:tr>
         <w:trPr>
           <w:trHeight w:val="205" w:hRule="atLeast"/>
+          <w:cantSplit/>
+          <w:tblHeader/>
         </w:trPr>
         <w:tc>
           <w:tcPr>
@@ -1633,6 +1267,7 @@
                 <w:sz w:val="2"/>
                 <w:szCs w:val="2"/>
               </w:rPr>
+              <w:spacing w:before="30" w:after="30" w:line="240" w:lineRule="auto"/>
             </w:pPr>
           </w:p>
         </w:tc>
@@ -1651,6 +1286,7 @@
                 <w:sz w:val="2"/>
                 <w:szCs w:val="2"/>
               </w:rPr>
+              <w:spacing w:before="30" w:after="30" w:line="240" w:lineRule="auto"/>
             </w:pPr>
           </w:p>
         </w:tc>
@@ -1666,13 +1302,12 @@
           <w:p>
             <w:pPr>
               <w:pStyle w:val="TableParagraph"/>
-              <w:spacing w:before="8"/>
-              <w:ind w:left="562"/>
               <w:rPr>
                 <w:rFonts w:ascii="Arial"/>
                 <w:b/>
                 <w:sz w:val="18"/>
               </w:rPr>
+              <w:spacing w:before="30" w:after="30" w:line="240" w:lineRule="auto"/>
             </w:pPr>
             <w:r>
               <w:rPr>
@@ -1698,14 +1333,12 @@
           <w:p>
             <w:pPr>
               <w:pStyle w:val="TableParagraph"/>
-              <w:spacing w:before="81"/>
-              <w:ind w:left="109" w:right="92"/>
-              <w:jc w:val="center"/>
               <w:rPr>
                 <w:rFonts w:ascii="Arial"/>
                 <w:b/>
                 <w:sz w:val="18"/>
               </w:rPr>
+              <w:spacing w:before="30" w:after="30" w:line="240" w:lineRule="auto"/>
             </w:pPr>
             <w:r>
               <w:rPr>
@@ -1720,13 +1353,12 @@
           <w:p>
             <w:pPr>
               <w:pStyle w:val="TableParagraph"/>
-              <w:ind w:left="109" w:right="92"/>
-              <w:jc w:val="center"/>
               <w:rPr>
                 <w:rFonts w:ascii="Arial"/>
                 <w:b/>
                 <w:sz w:val="18"/>
               </w:rPr>
+              <w:spacing w:before="30" w:after="30" w:line="240" w:lineRule="auto"/>
             </w:pPr>
             <w:r>
               <w:rPr>
@@ -1752,13 +1384,12 @@
           <w:p>
             <w:pPr>
               <w:pStyle w:val="TableParagraph"/>
-              <w:spacing w:before="1"/>
-              <w:ind w:left="849"/>
               <w:rPr>
                 <w:rFonts w:ascii="Arial"/>
                 <w:b/>
                 <w:sz w:val="18"/>
               </w:rPr>
+              <w:spacing w:before="30" w:after="30" w:line="240" w:lineRule="auto"/>
             </w:pPr>
             <w:r>
               <w:rPr>
@@ -1775,6 +1406,8 @@
       <w:tr>
         <w:trPr>
           <w:trHeight w:val="315" w:hRule="atLeast"/>
+          <w:cantSplit/>
+          <w:tblHeader/>
         </w:trPr>
         <w:tc>
           <w:tcPr>
@@ -1791,6 +1424,7 @@
                 <w:sz w:val="2"/>
                 <w:szCs w:val="2"/>
               </w:rPr>
+              <w:spacing w:before="30" w:after="30" w:line="240" w:lineRule="auto"/>
             </w:pPr>
           </w:p>
         </w:tc>
@@ -1809,6 +1443,7 @@
                 <w:sz w:val="2"/>
                 <w:szCs w:val="2"/>
               </w:rPr>
+              <w:spacing w:before="30" w:after="30" w:line="240" w:lineRule="auto"/>
             </w:pPr>
           </w:p>
         </w:tc>
@@ -1823,13 +1458,12 @@
           <w:p>
             <w:pPr>
               <w:pStyle w:val="TableParagraph"/>
-              <w:spacing w:before="64"/>
-              <w:ind w:left="69"/>
               <w:rPr>
                 <w:rFonts w:ascii="Arial"/>
                 <w:b/>
                 <w:sz w:val="16"/>
               </w:rPr>
+              <w:spacing w:before="30" w:after="30" w:line="240" w:lineRule="auto"/>
             </w:pPr>
             <w:r>
               <w:rPr>
@@ -1850,13 +1484,12 @@
           <w:p>
             <w:pPr>
               <w:pStyle w:val="TableParagraph"/>
-              <w:spacing w:before="72"/>
-              <w:ind w:left="138"/>
               <w:rPr>
                 <w:rFonts w:ascii="Arial"/>
                 <w:b/>
                 <w:sz w:val="16"/>
               </w:rPr>
+              <w:spacing w:before="30" w:after="30" w:line="240" w:lineRule="auto"/>
             </w:pPr>
             <w:r>
               <w:rPr>
@@ -1885,6 +1518,7 @@
                 <w:sz w:val="2"/>
                 <w:szCs w:val="2"/>
               </w:rPr>
+              <w:spacing w:before="30" w:after="30" w:line="240" w:lineRule="auto"/>
             </w:pPr>
           </w:p>
         </w:tc>
@@ -1900,13 +1534,12 @@
           <w:p>
             <w:pPr>
               <w:pStyle w:val="TableParagraph"/>
-              <w:spacing/>
-              <w:ind w:left="182" w:right="150" w:firstLine="38"/>
               <w:rPr>
                 <w:rFonts w:ascii="Arial"/>
                 <w:b/>
                 <w:sz w:val="14"/>
               </w:rPr>
+              <w:spacing w:before="30" w:after="30" w:line="240" w:lineRule="auto"/>
             </w:pPr>
             <w:r>
               <w:rPr>
@@ -1949,13 +1582,12 @@
           <w:p>
             <w:pPr>
               <w:pStyle w:val="TableParagraph"/>
-              <w:spacing w:before="83"/>
-              <w:ind w:left="243"/>
               <w:rPr>
                 <w:rFonts w:ascii="Arial"/>
                 <w:b/>
                 <w:sz w:val="14"/>
               </w:rPr>
+              <w:spacing w:before="30" w:after="30" w:line="240" w:lineRule="auto"/>
             </w:pPr>
             <w:r>
               <w:rPr>
@@ -1979,13 +1611,12 @@
           <w:p>
             <w:pPr>
               <w:pStyle w:val="TableParagraph"/>
-              <w:spacing w:before="83"/>
-              <w:ind w:left="58"/>
               <w:rPr>
                 <w:rFonts w:ascii="Arial"/>
                 <w:b/>
                 <w:sz w:val="14"/>
               </w:rPr>
+              <w:spacing w:before="30" w:after="30" w:line="240" w:lineRule="auto"/>
             </w:pPr>
             <w:r>
               <w:rPr>
@@ -2002,6 +1633,7 @@
       <w:tr>
         <w:trPr>
           <w:trHeight w:val="250" w:hRule="atLeast"/>
+          <w:cantSplit/>
         </w:trPr>
         <w:tc>
           <w:tcPr>
@@ -2017,11 +1649,12 @@
                 <w:rFonts w:ascii="Times New Roman"/>
                 <w:sz w:val="16"/>
               </w:rPr>
+              <w:spacing w:before="30" w:after="30" w:line="240" w:lineRule="auto"/>
             </w:pPr>
             <w:r>
               <w:rPr>
                 <w:rFonts w:ascii="Times New Roman" w:hAnsi="Times New Roman"/>
-                <w:sz w:val="18"/>
+                <w:sz w:val="20"/>
               </w:rPr>
               <w:t>{{ITEM_QUANTITY}}</w:t>
             </w:r>
@@ -2041,11 +1674,12 @@
                 <w:rFonts w:ascii="Times New Roman"/>
                 <w:sz w:val="16"/>
               </w:rPr>
+              <w:spacing w:before="30" w:after="30" w:line="240" w:lineRule="auto"/>
             </w:pPr>
             <w:r>
               <w:rPr>
                 <w:rFonts w:ascii="Times New Roman" w:hAnsi="Times New Roman"/>
-                <w:sz w:val="18"/>
+                <w:sz w:val="20"/>
               </w:rPr>
               <w:t>{{ITEM_DESCRIPTION}}</w:t>
             </w:r>
@@ -2065,6 +1699,7 @@
                 <w:rFonts w:ascii="Times New Roman"/>
                 <w:sz w:val="16"/>
               </w:rPr>
+              <w:spacing w:before="30" w:after="30" w:line="240" w:lineRule="auto"/>
             </w:pPr>
           </w:p>
         </w:tc>
@@ -2082,6 +1717,7 @@
                 <w:rFonts w:ascii="Times New Roman"/>
                 <w:sz w:val="16"/>
               </w:rPr>
+              <w:spacing w:before="30" w:after="30" w:line="240" w:lineRule="auto"/>
             </w:pPr>
           </w:p>
         </w:tc>
@@ -2100,6 +1736,7 @@
                 <w:rFonts w:ascii="Times New Roman"/>
                 <w:sz w:val="16"/>
               </w:rPr>
+              <w:spacing w:before="30" w:after="30" w:line="240" w:lineRule="auto"/>
             </w:pPr>
           </w:p>
         </w:tc>
@@ -2119,6 +1756,7 @@
                 <w:rFonts w:ascii="Times New Roman"/>
                 <w:sz w:val="16"/>
               </w:rPr>
+              <w:spacing w:before="30" w:after="30" w:line="240" w:lineRule="auto"/>
             </w:pPr>
           </w:p>
         </w:tc>
@@ -2138,6 +1776,7 @@
                 <w:rFonts w:ascii="Times New Roman"/>
                 <w:sz w:val="16"/>
               </w:rPr>
+              <w:spacing w:before="30" w:after="30" w:line="240" w:lineRule="auto"/>
             </w:pPr>
           </w:p>
         </w:tc>
@@ -2156,6 +1795,7 @@
                 <w:rFonts w:ascii="Times New Roman"/>
                 <w:sz w:val="16"/>
               </w:rPr>
+              <w:spacing w:before="30" w:after="30" w:line="240" w:lineRule="auto"/>
             </w:pPr>
           </w:p>
         </w:tc>
@@ -2169,727 +1809,175 @@
         </w:rPr>
       </w:pPr>
     </w:p>
-    <w:p>
-      <w:pPr>
-        <w:pStyle w:val="BodyText"/>
-        <w:ind w:left="350"/>
-      </w:pPr>
-      <w:r>
-        <w:rPr>
-          <w:noProof/>
-          <w:sz w:val="29"/>
-        </w:rPr>
-        <mc:AlternateContent>
-          <mc:Choice Requires="wps">
-            <w:drawing>
-              <wp:anchor distT="45720" distB="45720" distL="114300" distR="114300" simplePos="0" relativeHeight="251661312" behindDoc="0" locked="0" layoutInCell="1" allowOverlap="1" wp14:anchorId="3E07DA87" wp14:editId="176B7015">
-                <wp:simplePos x="0" y="0"/>
-                <wp:positionH relativeFrom="column">
-                  <wp:posOffset>2472690</wp:posOffset>
-                </wp:positionH>
-                <wp:positionV relativeFrom="paragraph">
-                  <wp:posOffset>123825</wp:posOffset>
-                </wp:positionV>
-                <wp:extent cx="2360930" cy="1404620"/>
-                <wp:effectExtent l="0" t="0" r="0" b="5715"/>
-                <wp:wrapNone/>
-                <wp:docPr id="217" name="Text Box 2"/>
-                <wp:cNvGraphicFramePr>
-                  <a:graphicFrameLocks xmlns:a="http://schemas.openxmlformats.org/drawingml/2006/main"/>
-                </wp:cNvGraphicFramePr>
-                <a:graphic xmlns:a="http://schemas.openxmlformats.org/drawingml/2006/main">
-                  <a:graphicData uri="http://schemas.microsoft.com/office/word/2010/wordprocessingShape">
-                    <wps:wsp>
-                      <wps:cNvSpPr txBox="1">
-                        <a:spLocks noChangeArrowheads="1"/>
-                      </wps:cNvSpPr>
-                      <wps:spPr bwMode="auto">
-                        <a:xfrm>
-                          <a:off x="0" y="0"/>
-                          <a:ext cx="2360930" cy="1404620"/>
-                        </a:xfrm>
-                        <a:prstGeom prst="rect">
-                          <a:avLst/>
-                        </a:prstGeom>
-                        <a:noFill/>
-                        <a:ln w="9525">
-                          <a:noFill/>
-                          <a:miter lim="800000"/>
-                          <a:headEnd/>
-                          <a:tailEnd/>
-                        </a:ln>
-                      </wps:spPr>
-                      <wps:txbx>
-                        <w:txbxContent>
-                          <w:p>
-                            <w:pPr>
-                              <w:rPr>
-                                <w:rFonts w:ascii="Arial" w:hAnsi="Arial" w:cs="Arial"/>
-                                <w:b/>
-                                <w:bCs/>
-                              </w:rPr>
-                            </w:pPr>
-                            <w:r>
-                              <w:rPr>
-                                <w:rFonts w:ascii="Arial" w:hAnsi="Arial" w:cs="Arial"/>
-                                <w:b/>
-                                <w:bCs/>
-                              </w:rPr>
-                              <w:t>CRISTIAN JAY M. PECHON</w:t>
-                            </w:r>
-                          </w:p>
-                        </w:txbxContent>
-                      </wps:txbx>
-                      <wps:bodyPr rot="0" vert="horz" wrap="square" lIns="91440" tIns="45720" rIns="91440" bIns="45720" anchor="t" anchorCtr="0">
-                        <a:spAutoFit/>
-                      </wps:bodyPr>
-                    </wps:wsp>
-                  </a:graphicData>
-                </a:graphic>
-                <wp14:sizeRelH relativeFrom="margin">
-                  <wp14:pctWidth>40000</wp14:pctWidth>
-                </wp14:sizeRelH>
-                <wp14:sizeRelV relativeFrom="margin">
-                  <wp14:pctHeight>20000</wp14:pctHeight>
-                </wp14:sizeRelV>
-              </wp:anchor>
-            </w:drawing>
-          </mc:Choice>
-          <mc:Fallback>
-            <w:pict>
-              <v:shapetype w14:anchorId="3E07DA87" id="_x0000_t202" coordsize="21600,21600" o:spt="202" path="m,l,21600r21600,l21600,xe">
-                <v:stroke joinstyle="miter"/>
-                <v:path gradientshapeok="t" o:connecttype="rect"/>
-              </v:shapetype>
-              <v:shape id="Text Box 2" o:spid="_x0000_s1026" type="#_x0000_t202" style="position:absolute;left:0;text-align:left;margin-left:194.7pt;margin-top:9.75pt;width:185.9pt;height:110.6pt;z-index:251661312;visibility:visible;mso-wrap-style:square;mso-width-percent:400;mso-height-percent:200;mso-wrap-distance-left:9pt;mso-wrap-distance-top:3.6pt;mso-wrap-distance-right:9pt;mso-wrap-distance-bottom:3.6pt;mso-position-horizontal:absolute;mso-position-horizontal-relative:text;mso-position-vertical:absolute;mso-position-vertical-relative:text;mso-width-percent:400;mso-height-percent:200;mso-width-relative:margin;mso-height-relative:margin;v-text-anchor:top" o:gfxdata="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" filled="f" stroked="f">
-                <v:textbox style="mso-fit-shape-to-text:t">
-                  <w:txbxContent>
-                    <w:p>
-                      <w:pPr>
-                        <w:rPr>
-                          <w:rFonts w:ascii="Arial" w:hAnsi="Arial" w:cs="Arial"/>
-                          <w:b/>
-                          <w:bCs/>
-                        </w:rPr>
-                      </w:pPr>
-                      <w:r>
-                        <w:rPr>
-                          <w:rFonts w:ascii="Arial" w:hAnsi="Arial" w:cs="Arial"/>
-                          <w:b/>
-                          <w:bCs/>
-                        </w:rPr>
-                        <w:t>CRISTIAN JAY M. PECHON</w:t>
-                      </w:r>
-                    </w:p>
-                  </w:txbxContent>
-                </v:textbox>
-              </v:shape>
-            </w:pict>
-          </mc:Fallback>
-        </mc:AlternateContent>
-      </w:r>
-      <w:r>
-        <w:rPr>
-          <w:noProof/>
-        </w:rPr>
-        <mc:AlternateContent>
-          <mc:Choice Requires="wps">
-            <w:drawing>
-              <wp:anchor distT="0" distB="0" distL="0" distR="0" simplePos="0" relativeHeight="251656192" behindDoc="0" locked="0" layoutInCell="1" allowOverlap="1" wp14:anchorId="71079F7E" wp14:editId="667CA732">
-                <wp:simplePos x="0" y="0"/>
-                <wp:positionH relativeFrom="page">
-                  <wp:posOffset>2679700</wp:posOffset>
-                </wp:positionH>
-                <wp:positionV relativeFrom="paragraph">
-                  <wp:posOffset>-61321</wp:posOffset>
-                </wp:positionV>
-                <wp:extent cx="2197100" cy="722630"/>
-                <wp:effectExtent l="0" t="0" r="0" b="0"/>
-                <wp:wrapNone/>
-                <wp:docPr id="13" name="Textbox 13"/>
-                <wp:cNvGraphicFramePr>
-                  <a:graphicFrameLocks xmlns:a="http://schemas.openxmlformats.org/drawingml/2006/main"/>
-                </wp:cNvGraphicFramePr>
-                <a:graphic xmlns:a="http://schemas.openxmlformats.org/drawingml/2006/main">
-                  <a:graphicData uri="http://schemas.microsoft.com/office/word/2010/wordprocessingShape">
-                    <wps:wsp>
-                      <wps:cNvSpPr txBox="1">
-                        <a:spLocks/>
-                      </wps:cNvSpPr>
-                      <wps:spPr>
-                        <a:xfrm>
-                          <a:off x="0" y="0"/>
-                          <a:ext cx="2197100" cy="722630"/>
-                        </a:xfrm>
-                        <a:prstGeom prst="rect">
-                          <a:avLst/>
-                        </a:prstGeom>
-                      </wps:spPr>
-                      <wps:txbx>
-                        <w:txbxContent>
-                          <w:tbl>
-                            <w:tblPr>
-                              <w:tblW w:w="0" w:type="auto"/>
-                              <w:tblInd w:w="70" w:type="dxa"/>
-                              <w:tblBorders>
-                                <w:top w:val="single" w:sz="8" w:space="0" w:color="000000"/>
-                                <w:left w:val="single" w:sz="8" w:space="0" w:color="000000"/>
-                                <w:bottom w:val="single" w:sz="8" w:space="0" w:color="000000"/>
-                                <w:right w:val="single" w:sz="8" w:space="0" w:color="000000"/>
-                                <w:insideH w:val="single" w:sz="8" w:space="0" w:color="000000"/>
-                                <w:insideV w:val="single" w:sz="8" w:space="0" w:color="000000"/>
-                              </w:tblBorders>
-                              <w:tblLayout w:type="fixed"/>
-                              <w:tblCellMar>
-                                <w:left w:w="0" w:type="dxa"/>
-                                <w:right w:w="0" w:type="dxa"/>
-                              </w:tblCellMar>
-                              <w:tblLook w:val="01E0" w:firstRow="1" w:lastRow="1" w:firstColumn="1" w:lastColumn="1" w:noHBand="0" w:noVBand="0"/>
-                            </w:tblPr>
-                            <w:tblGrid>
-                              <w:gridCol w:w="3320"/>
-                            </w:tblGrid>
-                            <w:tr>
-                              <w:trPr>
-                                <w:trHeight w:val="279"/>
-                              </w:trPr>
-                              <w:tc>
-                                <w:tcPr>
-                                  <w:tcW w:w="3320" w:type="dxa"/>
-                                </w:tcPr>
-                                <w:p>
-                                  <w:pPr>
-                                    <w:pStyle w:val="TableParagraph"/>
-                                    <w:spacing w:before="76" w:line="183" w:lineRule="exact"/>
-                                    <w:rPr>
-                                      <w:sz w:val="18"/>
-                                    </w:rPr>
-                                  </w:pPr>
-                                  <w:r>
-                                    <w:rPr>
-                                      <w:sz w:val="18"/>
-                                    </w:rPr>
-                                    <w:t xml:space="preserve">Noted </w:t>
-                                  </w:r>
-                                  <w:r>
-                                    <w:rPr>
-                                      <w:spacing w:val="-5"/>
-                                      <w:sz w:val="18"/>
-                                    </w:rPr>
-                                    <w:t>by:</w:t>
-                                  </w:r>
-                                </w:p>
-                              </w:tc>
-                            </w:tr>
-                            <w:tr>
-                              <w:trPr>
-                                <w:trHeight w:val="340"/>
-                              </w:trPr>
-                              <w:tc>
-                                <w:tcPr>
-                                  <w:tcW w:w="3320" w:type="dxa"/>
-                                </w:tcPr>
-                                <w:p>
-                                  <w:pPr>
-                                    <w:pStyle w:val="TableParagraph"/>
-                                    <w:rPr>
-                                      <w:rFonts w:ascii="Times New Roman"/>
-                                      <w:b/>
-                                      <w:bCs/>
-                                      <w:sz w:val="16"/>
-                                    </w:rPr>
-                                  </w:pPr>
-                                </w:p>
-                              </w:tc>
-                            </w:tr>
-                            <w:tr>
-                              <w:trPr>
-                                <w:trHeight w:val="180"/>
-                              </w:trPr>
-                              <w:tc>
-                                <w:tcPr>
-                                  <w:tcW w:w="3320" w:type="dxa"/>
-                                </w:tcPr>
-                                <w:p>
-                                  <w:pPr>
-                                    <w:pStyle w:val="TableParagraph"/>
-                                    <w:spacing w:before="13" w:line="146" w:lineRule="exact"/>
-                                    <w:rPr>
-                                      <w:sz w:val="16"/>
-                                    </w:rPr>
-                                  </w:pPr>
-                                  <w:r>
-                                    <w:rPr>
-                                      <w:spacing w:val="-2"/>
-                                      <w:sz w:val="16"/>
-                                    </w:rPr>
-                                    <w:t>Laboratory</w:t>
-                                  </w:r>
-                                  <w:r>
-                                    <w:rPr>
-                                      <w:spacing w:val="13"/>
-                                      <w:sz w:val="16"/>
-                                    </w:rPr>
-                                    <w:t xml:space="preserve"> </w:t>
-                                  </w:r>
-                                  <w:r>
-                                    <w:rPr>
-                                      <w:spacing w:val="-2"/>
-                                      <w:sz w:val="16"/>
-                                    </w:rPr>
-                                    <w:t>In-Charge</w:t>
-                                  </w:r>
-                                </w:p>
-                              </w:tc>
-                            </w:tr>
-                            <w:tr>
-                              <w:trPr>
-                                <w:trHeight w:val="239"/>
-                              </w:trPr>
-                              <w:tc>
-                                <w:tcPr>
-                                  <w:tcW w:w="3320" w:type="dxa"/>
-                                </w:tcPr>
-                                <w:p>
-                                  <w:pPr>
-                                    <w:pStyle w:val="TableParagraph"/>
-                                    <w:spacing w:before="40" w:line="179" w:lineRule="exact"/>
-                                    <w:rPr>
-                                      <w:sz w:val="16"/>
-                                    </w:rPr>
-                                  </w:pPr>
-                                  <w:r>
-                                    <w:rPr>
-                                      <w:sz w:val="16"/>
-                                    </w:rPr>
-                                    <w:t>Signature</w:t>
-                                  </w:r>
-                                  <w:r>
-                                    <w:rPr>
-                                      <w:spacing w:val="-7"/>
-                                      <w:sz w:val="16"/>
-                                    </w:rPr>
-                                    <w:t xml:space="preserve"> </w:t>
-                                  </w:r>
-                                  <w:r>
-                                    <w:rPr>
-                                      <w:sz w:val="16"/>
-                                    </w:rPr>
-                                    <w:t>Over</w:t>
-                                  </w:r>
-                                  <w:r>
-                                    <w:rPr>
-                                      <w:spacing w:val="-7"/>
-                                      <w:sz w:val="16"/>
-                                    </w:rPr>
-                                    <w:t xml:space="preserve"> </w:t>
-                                  </w:r>
-                                  <w:r>
-                                    <w:rPr>
-                                      <w:sz w:val="16"/>
-                                    </w:rPr>
-                                    <w:t>Printed</w:t>
-                                  </w:r>
-                                  <w:r>
-                                    <w:rPr>
-                                      <w:spacing w:val="-6"/>
-                                      <w:sz w:val="16"/>
-                                    </w:rPr>
-                                    <w:t xml:space="preserve"> </w:t>
-                                  </w:r>
-                                  <w:r>
-                                    <w:rPr>
-                                      <w:spacing w:val="-2"/>
-                                      <w:sz w:val="16"/>
-                                    </w:rPr>
-                                    <w:t>Name/Date</w:t>
-                                  </w:r>
-                                </w:p>
-                              </w:tc>
-                            </w:tr>
-                          </w:tbl>
-                          <w:p>
-                            <w:pPr>
-                              <w:pStyle w:val="BodyText"/>
-                            </w:pPr>
-                          </w:p>
-                        </w:txbxContent>
-                      </wps:txbx>
-                      <wps:bodyPr wrap="square" lIns="0" tIns="0" rIns="0" bIns="0" rtlCol="0">
-                        <a:noAutofit/>
-                      </wps:bodyPr>
-                    </wps:wsp>
-                  </a:graphicData>
-                </a:graphic>
-              </wp:anchor>
-            </w:drawing>
-          </mc:Choice>
-          <mc:Fallback>
-            <w:pict>
-              <v:shape w14:anchorId="71079F7E" id="Textbox 13" o:spid="_x0000_s1027" type="#_x0000_t202" style="position:absolute;left:0;text-align:left;margin-left:211pt;margin-top:-4.85pt;width:173pt;height:56.9pt;z-index:251656192;visibility:visible;mso-wrap-style:square;mso-wrap-distance-left:0;mso-wrap-distance-top:0;mso-wrap-distance-right:0;mso-wrap-distance-bottom:0;mso-position-horizontal:absolute;mso-position-horizontal-relative:page;mso-position-vertical:absolute;mso-position-vertical-relative:text;v-text-anchor:top" o:gfxdata="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" filled="f" stroked="f">
-                <v:textbox inset="0,0,0,0">
-                  <w:txbxContent>
-                    <w:tbl>
-                      <w:tblPr>
-                        <w:tblW w:w="0" w:type="auto"/>
-                        <w:tblInd w:w="70" w:type="dxa"/>
-                        <w:tblBorders>
-                          <w:top w:val="single" w:sz="8" w:space="0" w:color="000000"/>
-                          <w:left w:val="single" w:sz="8" w:space="0" w:color="000000"/>
-                          <w:bottom w:val="single" w:sz="8" w:space="0" w:color="000000"/>
-                          <w:right w:val="single" w:sz="8" w:space="0" w:color="000000"/>
-                          <w:insideH w:val="single" w:sz="8" w:space="0" w:color="000000"/>
-                          <w:insideV w:val="single" w:sz="8" w:space="0" w:color="000000"/>
-                        </w:tblBorders>
-                        <w:tblLayout w:type="fixed"/>
-                        <w:tblCellMar>
-                          <w:left w:w="0" w:type="dxa"/>
-                          <w:right w:w="0" w:type="dxa"/>
-                        </w:tblCellMar>
-                        <w:tblLook w:val="01E0" w:firstRow="1" w:lastRow="1" w:firstColumn="1" w:lastColumn="1" w:noHBand="0" w:noVBand="0"/>
-                      </w:tblPr>
-                      <w:tblGrid>
-                        <w:gridCol w:w="3320"/>
-                      </w:tblGrid>
-                      <w:tr>
-                        <w:trPr>
-                          <w:trHeight w:val="279"/>
-                        </w:trPr>
-                        <w:tc>
-                          <w:tcPr>
-                            <w:tcW w:w="3320" w:type="dxa"/>
-                          </w:tcPr>
-                          <w:p>
-                            <w:pPr>
-                              <w:pStyle w:val="TableParagraph"/>
-                              <w:spacing w:before="76" w:line="183" w:lineRule="exact"/>
-                              <w:rPr>
-                                <w:sz w:val="18"/>
-                              </w:rPr>
-                            </w:pPr>
-                            <w:r>
-                              <w:rPr>
-                                <w:sz w:val="18"/>
-                              </w:rPr>
-                              <w:t xml:space="preserve">Noted </w:t>
-                            </w:r>
-                            <w:r>
-                              <w:rPr>
-                                <w:spacing w:val="-5"/>
-                                <w:sz w:val="18"/>
-                              </w:rPr>
-                              <w:t>by:</w:t>
-                            </w:r>
-                          </w:p>
-                        </w:tc>
-                      </w:tr>
-                      <w:tr>
-                        <w:trPr>
-                          <w:trHeight w:val="340"/>
-                        </w:trPr>
-                        <w:tc>
-                          <w:tcPr>
-                            <w:tcW w:w="3320" w:type="dxa"/>
-                          </w:tcPr>
-                          <w:p>
-                            <w:pPr>
-                              <w:pStyle w:val="TableParagraph"/>
-                              <w:rPr>
-                                <w:rFonts w:ascii="Times New Roman"/>
-                                <w:b/>
-                                <w:bCs/>
-                                <w:sz w:val="16"/>
-                              </w:rPr>
-                            </w:pPr>
-                          </w:p>
-                        </w:tc>
-                      </w:tr>
-                      <w:tr>
-                        <w:trPr>
-                          <w:trHeight w:val="180"/>
-                        </w:trPr>
-                        <w:tc>
-                          <w:tcPr>
-                            <w:tcW w:w="3320" w:type="dxa"/>
-                          </w:tcPr>
-                          <w:p>
-                            <w:pPr>
-                              <w:pStyle w:val="TableParagraph"/>
-                              <w:spacing w:before="13" w:line="146" w:lineRule="exact"/>
-                              <w:rPr>
-                                <w:sz w:val="16"/>
-                              </w:rPr>
-                            </w:pPr>
-                            <w:r>
-                              <w:rPr>
-                                <w:spacing w:val="-2"/>
-                                <w:sz w:val="16"/>
-                              </w:rPr>
-                              <w:t>Laboratory</w:t>
-                            </w:r>
-                            <w:r>
-                              <w:rPr>
-                                <w:spacing w:val="13"/>
-                                <w:sz w:val="16"/>
-                              </w:rPr>
-                              <w:t xml:space="preserve"> </w:t>
-                            </w:r>
-                            <w:r>
-                              <w:rPr>
-                                <w:spacing w:val="-2"/>
-                                <w:sz w:val="16"/>
-                              </w:rPr>
-                              <w:t>In-Charge</w:t>
-                            </w:r>
-                          </w:p>
-                        </w:tc>
-                      </w:tr>
-                      <w:tr>
-                        <w:trPr>
-                          <w:trHeight w:val="239"/>
-                        </w:trPr>
-                        <w:tc>
-                          <w:tcPr>
-                            <w:tcW w:w="3320" w:type="dxa"/>
-                          </w:tcPr>
-                          <w:p>
-                            <w:pPr>
-                              <w:pStyle w:val="TableParagraph"/>
-                              <w:spacing w:before="40" w:line="179" w:lineRule="exact"/>
-                              <w:rPr>
-                                <w:sz w:val="16"/>
-                              </w:rPr>
-                            </w:pPr>
-                            <w:r>
-                              <w:rPr>
-                                <w:sz w:val="16"/>
-                              </w:rPr>
-                              <w:t>Signature</w:t>
-                            </w:r>
-                            <w:r>
-                              <w:rPr>
-                                <w:spacing w:val="-7"/>
-                                <w:sz w:val="16"/>
-                              </w:rPr>
-                              <w:t xml:space="preserve"> </w:t>
-                            </w:r>
-                            <w:r>
-                              <w:rPr>
-                                <w:sz w:val="16"/>
-                              </w:rPr>
-                              <w:t>Over</w:t>
-                            </w:r>
-                            <w:r>
-                              <w:rPr>
-                                <w:spacing w:val="-7"/>
-                                <w:sz w:val="16"/>
-                              </w:rPr>
-                              <w:t xml:space="preserve"> </w:t>
-                            </w:r>
-                            <w:r>
-                              <w:rPr>
-                                <w:sz w:val="16"/>
-                              </w:rPr>
-                              <w:t>Printed</w:t>
-                            </w:r>
-                            <w:r>
-                              <w:rPr>
-                                <w:spacing w:val="-6"/>
-                                <w:sz w:val="16"/>
-                              </w:rPr>
-                              <w:t xml:space="preserve"> </w:t>
-                            </w:r>
-                            <w:r>
-                              <w:rPr>
-                                <w:spacing w:val="-2"/>
-                                <w:sz w:val="16"/>
-                              </w:rPr>
-                              <w:t>Name/Date</w:t>
-                            </w:r>
-                          </w:p>
-                        </w:tc>
-                      </w:tr>
-                    </w:tbl>
-                    <w:p>
-                      <w:pPr>
-                        <w:pStyle w:val="BodyText"/>
-                      </w:pPr>
-                    </w:p>
-                  </w:txbxContent>
-                </v:textbox>
-                <w10:wrap anchorx="page"/>
-              </v:shape>
-            </w:pict>
-          </mc:Fallback>
-        </mc:AlternateContent>
-      </w:r>
-      <w:r>
-        <w:t xml:space="preserve">Reserved </w:t>
-      </w:r>
-      <w:r>
-        <w:rPr>
-          <w:spacing w:val="-5"/>
-        </w:rPr>
-        <w:t>by:</w:t>
-      </w:r>
-    </w:p>
-    <w:p>
-      <w:pPr>
-        <w:pStyle w:val="BodyText"/>
-        <w:spacing w:before="9"/>
-        <w:rPr>
-          <w:sz w:val="29"/>
-        </w:rPr>
-      </w:pPr>
-      <w:r>
-        <w:rPr>
-          <w:noProof/>
-        </w:rPr>
-        <mc:AlternateContent>
-          <mc:Choice Requires="wps">
-            <w:drawing>
-              <wp:anchor distT="0" distB="0" distL="0" distR="0" simplePos="0" relativeHeight="487587840" behindDoc="1" locked="0" layoutInCell="1" allowOverlap="1" wp14:anchorId="2F1C18B5" wp14:editId="63ECA4A1">
-                <wp:simplePos x="0" y="0"/>
-                <wp:positionH relativeFrom="page">
-                  <wp:posOffset>520700</wp:posOffset>
-                </wp:positionH>
-                <wp:positionV relativeFrom="paragraph">
-                  <wp:posOffset>233071</wp:posOffset>
-                </wp:positionV>
-                <wp:extent cx="1917700" cy="1270"/>
-                <wp:effectExtent l="0" t="0" r="0" b="0"/>
-                <wp:wrapTopAndBottom/>
-                <wp:docPr id="14" name="Graphic 14"/>
-                <wp:cNvGraphicFramePr>
-                  <a:graphicFrameLocks xmlns:a="http://schemas.openxmlformats.org/drawingml/2006/main"/>
-                </wp:cNvGraphicFramePr>
-                <a:graphic xmlns:a="http://schemas.openxmlformats.org/drawingml/2006/main">
-                  <a:graphicData uri="http://schemas.microsoft.com/office/word/2010/wordprocessingShape">
-                    <wps:wsp>
-                      <wps:cNvSpPr>
-                        <a:spLocks/>
-                      </wps:cNvSpPr>
-                      <wps:spPr>
-                        <a:xfrm>
-                          <a:off x="0" y="0"/>
-                          <a:ext cx="1917700" cy="1270"/>
-                        </a:xfrm>
-                        <a:custGeom>
-                          <a:avLst/>
-                          <a:gdLst/>
-                          <a:ahLst/>
-                          <a:cxnLst/>
-                          <a:rect l="l" t="t" r="r" b="b"/>
-                          <a:pathLst>
-                            <a:path w="1917700">
-                              <a:moveTo>
-                                <a:pt x="0" y="0"/>
-                              </a:moveTo>
-                              <a:lnTo>
-                                <a:pt x="1917700" y="0"/>
-                              </a:lnTo>
-                            </a:path>
-                          </a:pathLst>
-                        </a:custGeom>
-                        <a:ln w="12700">
-                          <a:solidFill>
-                            <a:srgbClr val="000000"/>
-                          </a:solidFill>
-                          <a:prstDash val="solid"/>
-                        </a:ln>
-                      </wps:spPr>
-                      <wps:bodyPr wrap="square" lIns="0" tIns="0" rIns="0" bIns="0" rtlCol="0">
-                        <a:prstTxWarp prst="textNoShape">
-                          <a:avLst/>
-                        </a:prstTxWarp>
-                        <a:noAutofit/>
-                      </wps:bodyPr>
-                    </wps:wsp>
-                  </a:graphicData>
-                </a:graphic>
-              </wp:anchor>
-            </w:drawing>
-          </mc:Choice>
-          <mc:Fallback>
-            <w:pict>
-              <v:shape w14:anchorId="7E3CECF3" id="Graphic 14" o:spid="_x0000_s1026" style="position:absolute;margin-left:41pt;margin-top:18.35pt;width:151pt;height:.1pt;z-index:-15728640;visibility:visible;mso-wrap-style:square;mso-wrap-distance-left:0;mso-wrap-distance-top:0;mso-wrap-distance-right:0;mso-wrap-distance-bottom:0;mso-position-horizontal:absolute;mso-position-horizontal-relative:page;mso-position-vertical:absolute;mso-position-vertical-relative:text;v-text-anchor:top" coordsize="1917700,1270" o:gfxdata="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" path="m,l1917700,e" filled="f" strokeweight="1pt">
-                <v:path arrowok="t"/>
-                <w10:wrap type="topAndBottom" anchorx="page"/>
-              </v:shape>
-            </w:pict>
-          </mc:Fallback>
-        </mc:AlternateContent>
-      </w:r>
-      <w:r>
-        <w:rPr>
-          <w:rFonts w:ascii="Times New Roman" w:hAnsi="Times New Roman"/>
-          <w:sz w:val="18"/>
-        </w:rPr>
-        <w:t>{{INSTRUCTOR}}</w:t>
-      </w:r>
-    </w:p>
-    <w:p>
-      <w:pPr>
-        <w:spacing w:before="13"/>
-        <w:ind w:left="350"/>
-        <w:rPr>
-          <w:sz w:val="16"/>
-        </w:rPr>
-      </w:pPr>
-      <w:r>
-        <w:rPr>
-          <w:sz w:val="16"/>
-        </w:rPr>
-        <w:t>Signature</w:t>
-      </w:r>
-      <w:r>
-        <w:rPr>
-          <w:spacing w:val="-7"/>
-          <w:sz w:val="16"/>
-        </w:rPr>
-        <w:t xml:space="preserve"> </w:t>
-      </w:r>
-      <w:r>
-        <w:rPr>
-          <w:sz w:val="16"/>
-        </w:rPr>
-        <w:t>Over</w:t>
-      </w:r>
-      <w:r>
-        <w:rPr>
-          <w:spacing w:val="-7"/>
-          <w:sz w:val="16"/>
-        </w:rPr>
-        <w:t xml:space="preserve"> </w:t>
-      </w:r>
-      <w:r>
-        <w:rPr>
-          <w:sz w:val="16"/>
-        </w:rPr>
-        <w:t>Printed</w:t>
-      </w:r>
-      <w:r>
-        <w:rPr>
-          <w:spacing w:val="-6"/>
-          <w:sz w:val="16"/>
-        </w:rPr>
-        <w:t xml:space="preserve"> </w:t>
-      </w:r>
-      <w:r>
-        <w:rPr>
-          <w:spacing w:val="-4"/>
-          <w:sz w:val="16"/>
-        </w:rPr>
-        <w:t>Nam</w:t>
-      </w:r>
-      <w:r>
-        <w:rPr>
-          <w:spacing w:val="-4"/>
-          <w:sz w:val="16"/>
-        </w:rPr>
-        <w:t>e</w:t>
-      </w:r>
-    </w:p>
+    <w:tbl>
+      <w:tblPr>
+        <w:tblW w:w="10754" w:type="dxa"/>
+        <w:tblLayout w:type="fixed"/>
+        <w:tblBorders>
+          <w:top w:val="nil"/>
+          <w:left w:val="nil"/>
+          <w:bottom w:val="nil"/>
+          <w:right w:val="nil"/>
+          <w:insideH w:val="nil"/>
+          <w:insideV w:val="nil"/>
+        </w:tblBorders>
+      </w:tblPr>
+      <w:tblGrid>
+        <w:gridCol w:w="5377"/>
+        <w:gridCol w:w="5377"/>
+      </w:tblGrid>
+      <w:tr>
+        <w:trPr>
+          <w:cantSplit/>
+        </w:trPr>
+        <w:tc>
+          <w:tcPr>
+            <w:tcW w:w="5377" w:type="dxa"/>
+          </w:tcPr>
+          <w:p>
+            <w:pPr>
+              <w:spacing w:before="40" w:after="40" w:line="240" w:lineRule="auto"/>
+              <w:keepNext/>
+            </w:pPr>
+            <w:r>
+              <w:rPr>
+                <w:rFonts w:ascii="Arial" w:hAnsi="Arial"/>
+                <w:sz w:val="20"/>
+                <w:b/>
+              </w:rPr>
+              <w:t>Reserved by:</w:t>
+            </w:r>
+          </w:p>
+          <w:p>
+            <w:pPr>
+              <w:keepNext/>
+              <w:spacing w:before="0" w:after="0" w:line="660" w:lineRule="atLeast"/>
+            </w:pPr>
+            <w:r>
+              <w:rPr>
+                <w:rFonts w:ascii="Arial" w:hAnsi="Arial"/>
+                <w:sz w:val="18"/>
+              </w:rPr>
+              <w:t>{{SIGNATURE}}</w:t>
+            </w:r>
+          </w:p>
+          <w:p>
+            <w:pPr>
+              <w:spacing w:before="40" w:after="40" w:line="240" w:lineRule="auto"/>
+              <w:keepNext/>
+              <w:pBdr>
+                <w:top w:val="single" w:sz="4" w:space="4" w:color="000000"/>
+              </w:pBdr>
+            </w:pPr>
+            <w:r>
+              <w:rPr>
+                <w:rFonts w:ascii="Arial" w:hAnsi="Arial"/>
+                <w:sz w:val="18"/>
+              </w:rPr>
+              <w:t>{{INSTRUCTOR}}</w:t>
+            </w:r>
+          </w:p>
+          <w:p>
+            <w:pPr>
+              <w:spacing w:before="40" w:after="40" w:line="240" w:lineRule="auto"/>
+              <w:keepNext/>
+            </w:pPr>
+            <w:r>
+              <w:rPr>
+                <w:rFonts w:ascii="Arial" w:hAnsi="Arial"/>
+                <w:sz w:val="18"/>
+              </w:rPr>
+              <w:t>Signature over printed name</w:t>
+            </w:r>
+          </w:p>
+          <w:p>
+            <w:pPr>
+              <w:spacing w:before="40" w:after="40" w:line="240" w:lineRule="auto"/>
+            </w:pPr>
+            <w:r>
+              <w:rPr>
+                <w:rFonts w:ascii="Arial" w:hAnsi="Arial"/>
+                <w:sz w:val="18"/>
+              </w:rPr>
+              <w:t>Date signed: {{SIGNED_DATE}}</w:t>
+            </w:r>
+          </w:p>
+        </w:tc>
+        <w:tc>
+          <w:tcPr>
+            <w:tcW w:w="5377" w:type="dxa"/>
+          </w:tcPr>
+          <w:p>
+            <w:pPr>
+              <w:spacing w:before="40" w:after="40" w:line="240" w:lineRule="auto"/>
+              <w:keepNext/>
+            </w:pPr>
+            <w:r>
+              <w:rPr>
+                <w:rFonts w:ascii="Arial" w:hAnsi="Arial"/>
+                <w:sz w:val="20"/>
+                <w:b/>
+              </w:rPr>
+              <w:t>Noted by:</w:t>
+            </w:r>
+          </w:p>
+          <w:p>
+            <w:pPr>
+              <w:keepNext/>
+              <w:spacing w:before="0" w:after="0" w:line="660" w:lineRule="atLeast"/>
+            </w:pPr>
+            <w:r>
+              <w:rPr>
+                <w:rFonts w:ascii="Arial" w:hAnsi="Arial"/>
+                <w:sz w:val="18"/>
+              </w:rPr>
+              <w:t/>
+            </w:r>
+          </w:p>
+          <w:p>
+            <w:pPr>
+              <w:spacing w:before="40" w:after="40" w:line="240" w:lineRule="auto"/>
+              <w:keepNext/>
+              <w:pBdr>
+                <w:top w:val="single" w:sz="4" w:space="4" w:color="000000"/>
+              </w:pBdr>
+            </w:pPr>
+            <w:r>
+              <w:rPr>
+                <w:rFonts w:ascii="Arial" w:hAnsi="Arial"/>
+                <w:sz w:val="18"/>
+              </w:rPr>
+              <w:t>CRISTIAN JAY M. PECHON</w:t>
+            </w:r>
+          </w:p>
+          <w:p>
+            <w:pPr>
+              <w:spacing w:before="40" w:after="40" w:line="240" w:lineRule="auto"/>
+              <w:keepNext/>
+            </w:pPr>
+            <w:r>
+              <w:rPr>
+                <w:rFonts w:ascii="Arial" w:hAnsi="Arial"/>
+                <w:sz w:val="18"/>
+              </w:rPr>
+              <w:t>Laboratory In-Charge</w:t>
+            </w:r>
+          </w:p>
+          <w:p>
+            <w:pPr>
+              <w:spacing w:before="40" w:after="40" w:line="240" w:lineRule="auto"/>
+            </w:pPr>
+            <w:r>
+              <w:rPr>
+                <w:rFonts w:ascii="Arial" w:hAnsi="Arial"/>
+                <w:sz w:val="18"/>
+              </w:rPr>
+              <w:t>Signature over printed name / date: __________________</w:t>
+            </w:r>
+          </w:p>
+        </w:tc>
+      </w:tr>
+    </w:tbl>
     <w:sectPr>
       <w:pgSz w:w="11906" w:h="16838" w:code="9"/>
       <w:pgMar w:top="2000" w:right="600" w:bottom="380" w:left="460" w:header="355" w:footer="170" w:gutter="0"/>

</xml_diff>

<commit_message>
Align utilization form with official template
</commit_message>
<xml_diff>
--- a/frontend/public/documents/reservation-template.docx
+++ b/frontend/public/documents/reservation-template.docx
@@ -708,25 +708,148 @@
     </w:p>
     <w:p>
       <w:pPr>
-        <w:spacing w:before="40" w:after="40" w:line="240" w:lineRule="auto"/>
+        <w:pStyle w:val="BodyText"/>
+        <w:spacing w:before="140" w:after="60" w:line="240" w:lineRule="auto"/>
+        <w:jc w:val="center"/>
       </w:pPr>
       <w:r>
         <w:rPr>
-          <w:rFonts w:ascii="Arial" w:hAnsi="Arial"/>
+          <w:rFonts w:ascii="Segoe UI Symbol" w:hAnsi="Segoe UI Symbol"/>
+          <w:sz w:val="22"/>
+        </w:rPr>
+        <w:t>{{CHECK_BAR}}</w:t>
+      </w:r>
+      <w:r>
+        <w:rPr>
+          <w:rFonts w:ascii="Times New Roman" w:hAnsi="Times New Roman"/>
           <w:sz w:val="20"/>
-          <w:b/>
-        </w:rPr>
-        <w:t>Facility / laboratory: {{FACILITY}}</w:t>
+        </w:rPr>
+        <w:t xml:space="preserve"> Bar Area</w:t>
+      </w:r>
+      <w:r>
+        <w:t xml:space="preserve">    </w:t>
+      </w:r>
+      <w:r>
+        <w:rPr>
+          <w:rFonts w:ascii="Segoe UI Symbol" w:hAnsi="Segoe UI Symbol"/>
+          <w:sz w:val="22"/>
+        </w:rPr>
+        <w:t>{{CHECK_DINING}}</w:t>
+      </w:r>
+      <w:r>
+        <w:rPr>
+          <w:rFonts w:ascii="Times New Roman" w:hAnsi="Times New Roman"/>
+          <w:sz w:val="20"/>
+        </w:rPr>
+        <w:t xml:space="preserve"> Dining Area</w:t>
+      </w:r>
+      <w:r>
+        <w:t xml:space="preserve">    </w:t>
+      </w:r>
+      <w:r>
+        <w:rPr>
+          <w:rFonts w:ascii="Segoe UI Symbol" w:hAnsi="Segoe UI Symbol"/>
+          <w:sz w:val="22"/>
+        </w:rPr>
+        <w:t>{{CHECK_FRONT_OFFICE}}</w:t>
+      </w:r>
+      <w:r>
+        <w:rPr>
+          <w:rFonts w:ascii="Times New Roman" w:hAnsi="Times New Roman"/>
+          <w:sz w:val="20"/>
+        </w:rPr>
+        <w:t xml:space="preserve"> Front Office Area</w:t>
+      </w:r>
+      <w:r>
+        <w:br/>
+      </w:r>
+      <w:r>
+        <w:rPr>
+          <w:rFonts w:ascii="Segoe UI Symbol" w:hAnsi="Segoe UI Symbol"/>
+          <w:sz w:val="22"/>
+        </w:rPr>
+        <w:t>{{CHECK_KITCHEN}}</w:t>
+      </w:r>
+      <w:r>
+        <w:rPr>
+          <w:rFonts w:ascii="Times New Roman" w:hAnsi="Times New Roman"/>
+          <w:sz w:val="20"/>
+        </w:rPr>
+        <w:t xml:space="preserve"> Kitchen Area</w:t>
+      </w:r>
+      <w:r>
+        <w:t xml:space="preserve">    </w:t>
+      </w:r>
+      <w:r>
+        <w:rPr>
+          <w:rFonts w:ascii="Segoe UI Symbol" w:hAnsi="Segoe UI Symbol"/>
+          <w:sz w:val="22"/>
+        </w:rPr>
+        <w:t>{{CHECK_LAUNDRY}}</w:t>
+      </w:r>
+      <w:r>
+        <w:rPr>
+          <w:rFonts w:ascii="Times New Roman" w:hAnsi="Times New Roman"/>
+          <w:sz w:val="20"/>
+        </w:rPr>
+        <w:t xml:space="preserve"> Laundry Area</w:t>
+      </w:r>
+      <w:r>
+        <w:t xml:space="preserve">    </w:t>
+      </w:r>
+      <w:r>
+        <w:rPr>
+          <w:rFonts w:ascii="Segoe UI Symbol" w:hAnsi="Segoe UI Symbol"/>
+          <w:sz w:val="22"/>
+        </w:rPr>
+        <w:t>{{CHECK_ROOMS}}</w:t>
+      </w:r>
+      <w:r>
+        <w:rPr>
+          <w:rFonts w:ascii="Times New Roman" w:hAnsi="Times New Roman"/>
+          <w:sz w:val="20"/>
+        </w:rPr>
+        <w:t xml:space="preserve"> Rooms</w:t>
+      </w:r>
+      <w:r>
+        <w:t xml:space="preserve">    </w:t>
+      </w:r>
+      <w:r>
+        <w:rPr>
+          <w:rFonts w:ascii="Segoe UI Symbol" w:hAnsi="Segoe UI Symbol"/>
+          <w:sz w:val="22"/>
+        </w:rPr>
+        <w:t>{{CHECK_OTHER}}</w:t>
+      </w:r>
+      <w:r>
+        <w:rPr>
+          <w:rFonts w:ascii="Times New Roman" w:hAnsi="Times New Roman"/>
+          <w:sz w:val="20"/>
+        </w:rPr>
+        <w:t xml:space="preserve"> Other</w:t>
       </w:r>
     </w:p>
     <w:p>
       <w:pPr>
         <w:pStyle w:val="BodyText"/>
-        <w:spacing w:before="9"/>
+        <w:spacing w:before="9" w:after="120"/>
+        <w:jc w:val="center"/>
         <w:rPr>
           <w:sz w:val="15"/>
         </w:rPr>
       </w:pPr>
+      <w:r>
+        <w:rPr>
+          <w:b/>
+        </w:rPr>
+        <w:t xml:space="preserve">Selected space: </w:t>
+      </w:r>
+      <w:r>
+        <w:rPr>
+          <w:b/>
+        </w:rPr>
+        <w:t>{{FACILITY}}</w:t>
+      </w:r>
     </w:p>
     <w:tbl>
       <w:tblPr>
@@ -753,10 +876,12 @@
         <w:tc>
           <w:tcPr>
             <w:tcW w:w="1414" w:type="dxa"/>
+            <w:vAlign w:val="center"/>
           </w:tcPr>
           <w:p>
             <w:pPr>
               <w:pStyle w:val="TableParagraph"/>
+              <w:jc w:val="center"/>
               <w:rPr>
                 <w:sz w:val="18"/>
               </w:rPr>
@@ -764,12 +889,14 @@
             </w:pPr>
             <w:r>
               <w:rPr>
+                <w:b/>
                 <w:sz w:val="18"/>
               </w:rPr>
               <w:t xml:space="preserve">Date of </w:t>
             </w:r>
             <w:r>
               <w:rPr>
+                <w:b/>
                 <w:spacing w:val="-2"/>
                 <w:sz w:val="18"/>
               </w:rPr>
@@ -780,6 +907,7 @@
         <w:tc>
           <w:tcPr>
             <w:tcW w:w="2663" w:type="dxa"/>
+            <w:vAlign w:val="center"/>
           </w:tcPr>
           <w:p>
             <w:pPr>
@@ -787,6 +915,7 @@
               <w:tabs>
                 <w:tab w:val="left" w:pos="2401"/>
               </w:tabs>
+              <w:jc w:val="center"/>
               <w:rPr>
                 <w:rFonts w:ascii="Times New Roman"/>
                 <w:sz w:val="18"/>
@@ -796,6 +925,7 @@
             <w:r>
               <w:rPr>
                 <w:rFonts w:ascii="Times New Roman" w:hAnsi="Times New Roman"/>
+                <w:b/>
                 <w:sz w:val="20"/>
               </w:rPr>
               <w:t>{{USAGE_DATE}}</w:t>
@@ -805,10 +935,12 @@
         <w:tc>
           <w:tcPr>
             <w:tcW w:w="1059" w:type="dxa"/>
+            <w:vAlign w:val="center"/>
           </w:tcPr>
           <w:p>
             <w:pPr>
               <w:pStyle w:val="TableParagraph"/>
+              <w:jc w:val="center"/>
               <w:rPr>
                 <w:sz w:val="18"/>
               </w:rPr>
@@ -816,6 +948,7 @@
             </w:pPr>
             <w:r>
               <w:rPr>
+                <w:b/>
                 <w:spacing w:val="-2"/>
                 <w:sz w:val="18"/>
               </w:rPr>
@@ -826,6 +959,7 @@
         <w:tc>
           <w:tcPr>
             <w:tcW w:w="5618" w:type="dxa"/>
+            <w:vAlign w:val="center"/>
           </w:tcPr>
           <w:p>
             <w:pPr>
@@ -833,6 +967,7 @@
               <w:tabs>
                 <w:tab w:val="left" w:pos="5361"/>
               </w:tabs>
+              <w:jc w:val="center"/>
               <w:rPr>
                 <w:rFonts w:ascii="Times New Roman"/>
                 <w:sz w:val="18"/>
@@ -842,6 +977,7 @@
             <w:r>
               <w:rPr>
                 <w:rFonts w:ascii="Times New Roman" w:hAnsi="Times New Roman"/>
+                <w:b/>
                 <w:sz w:val="20"/>
               </w:rPr>
               <w:t>{{SUBJECT}}</w:t>
@@ -857,10 +993,12 @@
         <w:tc>
           <w:tcPr>
             <w:tcW w:w="1414" w:type="dxa"/>
+            <w:vAlign w:val="center"/>
           </w:tcPr>
           <w:p>
             <w:pPr>
               <w:pStyle w:val="TableParagraph"/>
+              <w:jc w:val="center"/>
               <w:rPr>
                 <w:sz w:val="18"/>
               </w:rPr>
@@ -868,12 +1006,14 @@
             </w:pPr>
             <w:r>
               <w:rPr>
+                <w:b/>
                 <w:sz w:val="18"/>
               </w:rPr>
               <w:t>Time</w:t>
             </w:r>
             <w:r>
               <w:rPr>
+                <w:b/>
                 <w:spacing w:val="-4"/>
                 <w:sz w:val="18"/>
               </w:rPr>
@@ -881,12 +1021,14 @@
             </w:r>
             <w:r>
               <w:rPr>
+                <w:b/>
                 <w:sz w:val="18"/>
               </w:rPr>
               <w:t>of</w:t>
             </w:r>
             <w:r>
               <w:rPr>
+                <w:b/>
                 <w:spacing w:val="-3"/>
                 <w:sz w:val="18"/>
               </w:rPr>
@@ -894,6 +1036,7 @@
             </w:r>
             <w:r>
               <w:rPr>
+                <w:b/>
                 <w:spacing w:val="-2"/>
                 <w:sz w:val="18"/>
               </w:rPr>
@@ -904,6 +1047,7 @@
         <w:tc>
           <w:tcPr>
             <w:tcW w:w="2663" w:type="dxa"/>
+            <w:vAlign w:val="center"/>
           </w:tcPr>
           <w:p>
             <w:pPr>
@@ -911,6 +1055,7 @@
               <w:tabs>
                 <w:tab w:val="left" w:pos="2401"/>
               </w:tabs>
+              <w:jc w:val="center"/>
               <w:rPr>
                 <w:rFonts w:ascii="Times New Roman"/>
                 <w:sz w:val="18"/>
@@ -920,6 +1065,7 @@
             <w:r>
               <w:rPr>
                 <w:rFonts w:ascii="Times New Roman" w:hAnsi="Times New Roman"/>
+                <w:b/>
                 <w:sz w:val="20"/>
               </w:rPr>
               <w:t>{{USAGE_TIME}}</w:t>
@@ -929,10 +1075,12 @@
         <w:tc>
           <w:tcPr>
             <w:tcW w:w="1059" w:type="dxa"/>
+            <w:vAlign w:val="center"/>
           </w:tcPr>
           <w:p>
             <w:pPr>
               <w:pStyle w:val="TableParagraph"/>
+              <w:jc w:val="center"/>
               <w:rPr>
                 <w:sz w:val="18"/>
               </w:rPr>
@@ -940,6 +1088,7 @@
             </w:pPr>
             <w:r>
               <w:rPr>
+                <w:b/>
                 <w:spacing w:val="-2"/>
                 <w:sz w:val="18"/>
               </w:rPr>
@@ -950,6 +1099,7 @@
         <w:tc>
           <w:tcPr>
             <w:tcW w:w="5618" w:type="dxa"/>
+            <w:vAlign w:val="center"/>
           </w:tcPr>
           <w:p>
             <w:pPr>
@@ -957,6 +1107,7 @@
               <w:tabs>
                 <w:tab w:val="left" w:pos="5361"/>
               </w:tabs>
+              <w:jc w:val="center"/>
               <w:rPr>
                 <w:rFonts w:ascii="Times New Roman"/>
                 <w:sz w:val="18"/>
@@ -966,6 +1117,7 @@
             <w:r>
               <w:rPr>
                 <w:rFonts w:ascii="Times New Roman" w:hAnsi="Times New Roman"/>
+                <w:b/>
                 <w:sz w:val="20"/>
               </w:rPr>
               <w:t>{{PURPOSE}}</w:t>
@@ -1030,10 +1182,12 @@
             <w:tcW w:w="1120" w:type="dxa"/>
             <w:vMerge w:val="restart"/>
             <w:shd w:val="clear" w:color="auto" w:fill="FDE9D9"/>
+            <w:vAlign w:val="center"/>
           </w:tcPr>
           <w:p>
             <w:pPr>
               <w:pStyle w:val="TableParagraph"/>
+              <w:jc w:val="center"/>
               <w:rPr>
                 <w:sz w:val="26"/>
               </w:rPr>
@@ -1043,6 +1197,7 @@
           <w:p>
             <w:pPr>
               <w:pStyle w:val="TableParagraph"/>
+              <w:jc w:val="center"/>
               <w:rPr>
                 <w:rFonts w:ascii="Arial"/>
                 <w:b/>
@@ -1066,10 +1221,12 @@
             <w:tcW w:w="3600" w:type="dxa"/>
             <w:vMerge w:val="restart"/>
             <w:shd w:val="clear" w:color="auto" w:fill="FDE9D9"/>
+            <w:vAlign w:val="center"/>
           </w:tcPr>
           <w:p>
             <w:pPr>
               <w:pStyle w:val="TableParagraph"/>
+              <w:jc w:val="center"/>
               <w:rPr>
                 <w:sz w:val="26"/>
               </w:rPr>
@@ -1079,6 +1236,7 @@
           <w:p>
             <w:pPr>
               <w:pStyle w:val="TableParagraph"/>
+              <w:jc w:val="center"/>
               <w:rPr>
                 <w:rFonts w:ascii="Arial"/>
                 <w:b/>
@@ -1113,10 +1271,12 @@
               <w:bottom w:val="single" w:sz="8" w:space="0" w:color="000000"/>
             </w:tcBorders>
             <w:shd w:val="clear" w:color="auto" w:fill="FDE9D9"/>
+            <w:vAlign w:val="center"/>
           </w:tcPr>
           <w:p>
             <w:pPr>
               <w:pStyle w:val="TableParagraph"/>
+              <w:jc w:val="center"/>
               <w:rPr>
                 <w:rFonts w:ascii="Arial"/>
                 <w:i/>
@@ -1127,6 +1287,7 @@
             <w:r>
               <w:rPr>
                 <w:rFonts w:ascii="Arial"/>
+                <w:b/>
                 <w:i/>
                 <w:sz w:val="14"/>
               </w:rPr>
@@ -1135,6 +1296,7 @@
             <w:r>
               <w:rPr>
                 <w:rFonts w:ascii="Arial"/>
+                <w:b/>
                 <w:i/>
                 <w:spacing w:val="-8"/>
                 <w:sz w:val="14"/>
@@ -1144,6 +1306,7 @@
             <w:r>
               <w:rPr>
                 <w:rFonts w:ascii="Arial"/>
+                <w:b/>
                 <w:i/>
                 <w:sz w:val="14"/>
               </w:rPr>
@@ -1152,6 +1315,7 @@
             <w:r>
               <w:rPr>
                 <w:rFonts w:ascii="Arial"/>
+                <w:b/>
                 <w:i/>
                 <w:spacing w:val="-7"/>
                 <w:sz w:val="14"/>
@@ -1161,6 +1325,7 @@
             <w:r>
               <w:rPr>
                 <w:rFonts w:ascii="Arial"/>
+                <w:b/>
                 <w:i/>
                 <w:sz w:val="14"/>
               </w:rPr>
@@ -1169,6 +1334,7 @@
             <w:r>
               <w:rPr>
                 <w:rFonts w:ascii="Arial"/>
+                <w:b/>
                 <w:i/>
                 <w:spacing w:val="-7"/>
                 <w:sz w:val="14"/>
@@ -1178,6 +1344,7 @@
             <w:r>
               <w:rPr>
                 <w:rFonts w:ascii="Arial"/>
+                <w:b/>
                 <w:i/>
                 <w:sz w:val="14"/>
               </w:rPr>
@@ -1186,6 +1353,7 @@
             <w:r>
               <w:rPr>
                 <w:rFonts w:ascii="Arial"/>
+                <w:b/>
                 <w:i/>
                 <w:spacing w:val="-8"/>
                 <w:sz w:val="14"/>
@@ -1195,6 +1363,7 @@
             <w:r>
               <w:rPr>
                 <w:rFonts w:ascii="Arial"/>
+                <w:b/>
                 <w:i/>
                 <w:sz w:val="14"/>
               </w:rPr>
@@ -1203,6 +1372,7 @@
             <w:r>
               <w:rPr>
                 <w:rFonts w:ascii="Arial"/>
+                <w:b/>
                 <w:i/>
                 <w:spacing w:val="-7"/>
                 <w:sz w:val="14"/>
@@ -1212,6 +1382,7 @@
             <w:r>
               <w:rPr>
                 <w:rFonts w:ascii="Arial"/>
+                <w:b/>
                 <w:i/>
                 <w:sz w:val="14"/>
               </w:rPr>
@@ -1220,6 +1391,7 @@
             <w:r>
               <w:rPr>
                 <w:rFonts w:ascii="Arial"/>
+                <w:b/>
                 <w:i/>
                 <w:spacing w:val="-7"/>
                 <w:sz w:val="14"/>
@@ -1229,6 +1401,7 @@
             <w:r>
               <w:rPr>
                 <w:rFonts w:ascii="Arial"/>
+                <w:b/>
                 <w:i/>
                 <w:sz w:val="14"/>
               </w:rPr>
@@ -1237,6 +1410,7 @@
             <w:r>
               <w:rPr>
                 <w:rFonts w:ascii="Arial"/>
+                <w:b/>
                 <w:i/>
                 <w:spacing w:val="-2"/>
                 <w:sz w:val="14"/>
@@ -1298,10 +1472,12 @@
               <w:top w:val="single" w:sz="8" w:space="0" w:color="000000"/>
             </w:tcBorders>
             <w:shd w:val="clear" w:color="auto" w:fill="FDE9D9"/>
+            <w:vAlign w:val="center"/>
           </w:tcPr>
           <w:p>
             <w:pPr>
               <w:pStyle w:val="TableParagraph"/>
+              <w:jc w:val="center"/>
               <w:rPr>
                 <w:rFonts w:ascii="Arial"/>
                 <w:b/>
@@ -1329,10 +1505,12 @@
               <w:right w:val="single" w:sz="8" w:space="0" w:color="000000"/>
             </w:tcBorders>
             <w:shd w:val="clear" w:color="auto" w:fill="FDE9D9"/>
+            <w:vAlign w:val="center"/>
           </w:tcPr>
           <w:p>
             <w:pPr>
               <w:pStyle w:val="TableParagraph"/>
+              <w:jc w:val="center"/>
               <w:rPr>
                 <w:rFonts w:ascii="Arial"/>
                 <w:b/>
@@ -1353,6 +1531,7 @@
           <w:p>
             <w:pPr>
               <w:pStyle w:val="TableParagraph"/>
+              <w:jc w:val="center"/>
               <w:rPr>
                 <w:rFonts w:ascii="Arial"/>
                 <w:b/>
@@ -1380,10 +1559,12 @@
               <w:left w:val="single" w:sz="8" w:space="0" w:color="000000"/>
             </w:tcBorders>
             <w:shd w:val="clear" w:color="auto" w:fill="FDE9D9"/>
+            <w:vAlign w:val="center"/>
           </w:tcPr>
           <w:p>
             <w:pPr>
               <w:pStyle w:val="TableParagraph"/>
+              <w:jc w:val="center"/>
               <w:rPr>
                 <w:rFonts w:ascii="Arial"/>
                 <w:b/>
@@ -1454,10 +1635,12 @@
               <w:top w:val="single" w:sz="8" w:space="0" w:color="000000"/>
             </w:tcBorders>
             <w:shd w:val="clear" w:color="auto" w:fill="FDE9D9"/>
+            <w:vAlign w:val="center"/>
           </w:tcPr>
           <w:p>
             <w:pPr>
               <w:pStyle w:val="TableParagraph"/>
+              <w:jc w:val="center"/>
               <w:rPr>
                 <w:rFonts w:ascii="Arial"/>
                 <w:b/>
@@ -1480,10 +1663,12 @@
           <w:tcPr>
             <w:tcW w:w="1040" w:type="dxa"/>
             <w:shd w:val="clear" w:color="auto" w:fill="FDE9D9"/>
+            <w:vAlign w:val="center"/>
           </w:tcPr>
           <w:p>
             <w:pPr>
               <w:pStyle w:val="TableParagraph"/>
+              <w:jc w:val="center"/>
               <w:rPr>
                 <w:rFonts w:ascii="Arial"/>
                 <w:b/>
@@ -1530,10 +1715,12 @@
               <w:right w:val="single" w:sz="8" w:space="0" w:color="000000"/>
             </w:tcBorders>
             <w:shd w:val="clear" w:color="auto" w:fill="FDE9D9"/>
+            <w:vAlign w:val="center"/>
           </w:tcPr>
           <w:p>
             <w:pPr>
               <w:pStyle w:val="TableParagraph"/>
+              <w:jc w:val="center"/>
               <w:rPr>
                 <w:rFonts w:ascii="Arial"/>
                 <w:b/>
@@ -1578,10 +1765,12 @@
               <w:right w:val="single" w:sz="8" w:space="0" w:color="000000"/>
             </w:tcBorders>
             <w:shd w:val="clear" w:color="auto" w:fill="FDE9D9"/>
+            <w:vAlign w:val="center"/>
           </w:tcPr>
           <w:p>
             <w:pPr>
               <w:pStyle w:val="TableParagraph"/>
+              <w:jc w:val="center"/>
               <w:rPr>
                 <w:rFonts w:ascii="Arial"/>
                 <w:b/>
@@ -1607,10 +1796,12 @@
               <w:left w:val="single" w:sz="8" w:space="0" w:color="000000"/>
             </w:tcBorders>
             <w:shd w:val="clear" w:color="auto" w:fill="FDE9D9"/>
+            <w:vAlign w:val="center"/>
           </w:tcPr>
           <w:p>
             <w:pPr>
               <w:pStyle w:val="TableParagraph"/>
+              <w:jc w:val="center"/>
               <w:rPr>
                 <w:rFonts w:ascii="Arial"/>
                 <w:b/>
@@ -1641,10 +1832,12 @@
             <w:tcBorders>
               <w:bottom w:val="single" w:sz="8" w:space="0" w:color="000000"/>
             </w:tcBorders>
+            <w:vAlign w:val="center"/>
           </w:tcPr>
           <w:p>
             <w:pPr>
               <w:pStyle w:val="TableParagraph"/>
+              <w:jc w:val="center"/>
               <w:rPr>
                 <w:rFonts w:ascii="Times New Roman"/>
                 <w:sz w:val="16"/>
@@ -1654,6 +1847,7 @@
             <w:r>
               <w:rPr>
                 <w:rFonts w:ascii="Times New Roman" w:hAnsi="Times New Roman"/>
+                <w:b/>
                 <w:sz w:val="20"/>
               </w:rPr>
               <w:t>{{ITEM_QUANTITY}}</w:t>
@@ -1666,10 +1860,12 @@
             <w:tcBorders>
               <w:bottom w:val="single" w:sz="8" w:space="0" w:color="000000"/>
             </w:tcBorders>
+            <w:vAlign w:val="center"/>
           </w:tcPr>
           <w:p>
             <w:pPr>
               <w:pStyle w:val="TableParagraph"/>
+              <w:jc w:val="center"/>
               <w:rPr>
                 <w:rFonts w:ascii="Times New Roman"/>
                 <w:sz w:val="16"/>
@@ -1679,6 +1875,7 @@
             <w:r>
               <w:rPr>
                 <w:rFonts w:ascii="Times New Roman" w:hAnsi="Times New Roman"/>
+                <w:b/>
                 <w:sz w:val="20"/>
               </w:rPr>
               <w:t>{{ITEM_DESCRIPTION}}</w:t>
@@ -1691,10 +1888,12 @@
             <w:tcBorders>
               <w:bottom w:val="single" w:sz="8" w:space="0" w:color="000000"/>
             </w:tcBorders>
+            <w:vAlign w:val="center"/>
           </w:tcPr>
           <w:p>
             <w:pPr>
               <w:pStyle w:val="TableParagraph"/>
+              <w:jc w:val="center"/>
               <w:rPr>
                 <w:rFonts w:ascii="Times New Roman"/>
                 <w:sz w:val="16"/>
@@ -1709,10 +1908,12 @@
             <w:tcBorders>
               <w:bottom w:val="single" w:sz="8" w:space="0" w:color="000000"/>
             </w:tcBorders>
+            <w:vAlign w:val="center"/>
           </w:tcPr>
           <w:p>
             <w:pPr>
               <w:pStyle w:val="TableParagraph"/>
+              <w:jc w:val="center"/>
               <w:rPr>
                 <w:rFonts w:ascii="Times New Roman"/>
                 <w:sz w:val="16"/>
@@ -1728,10 +1929,12 @@
               <w:bottom w:val="single" w:sz="8" w:space="0" w:color="000000"/>
               <w:right w:val="single" w:sz="8" w:space="0" w:color="000000"/>
             </w:tcBorders>
+            <w:vAlign w:val="center"/>
           </w:tcPr>
           <w:p>
             <w:pPr>
               <w:pStyle w:val="TableParagraph"/>
+              <w:jc w:val="center"/>
               <w:rPr>
                 <w:rFonts w:ascii="Times New Roman"/>
                 <w:sz w:val="16"/>
@@ -1748,10 +1951,12 @@
               <w:bottom w:val="single" w:sz="8" w:space="0" w:color="000000"/>
               <w:right w:val="single" w:sz="8" w:space="0" w:color="000000"/>
             </w:tcBorders>
+            <w:vAlign w:val="center"/>
           </w:tcPr>
           <w:p>
             <w:pPr>
               <w:pStyle w:val="TableParagraph"/>
+              <w:jc w:val="center"/>
               <w:rPr>
                 <w:rFonts w:ascii="Times New Roman"/>
                 <w:sz w:val="16"/>
@@ -1768,10 +1973,12 @@
               <w:bottom w:val="single" w:sz="8" w:space="0" w:color="000000"/>
               <w:right w:val="single" w:sz="8" w:space="0" w:color="000000"/>
             </w:tcBorders>
+            <w:vAlign w:val="center"/>
           </w:tcPr>
           <w:p>
             <w:pPr>
               <w:pStyle w:val="TableParagraph"/>
+              <w:jc w:val="center"/>
               <w:rPr>
                 <w:rFonts w:ascii="Times New Roman"/>
                 <w:sz w:val="16"/>
@@ -1787,10 +1994,12 @@
               <w:left w:val="single" w:sz="8" w:space="0" w:color="000000"/>
               <w:bottom w:val="single" w:sz="8" w:space="0" w:color="000000"/>
             </w:tcBorders>
+            <w:vAlign w:val="center"/>
           </w:tcPr>
           <w:p>
             <w:pPr>
               <w:pStyle w:val="TableParagraph"/>
+              <w:jc w:val="center"/>
               <w:rPr>
                 <w:rFonts w:ascii="Times New Roman"/>
                 <w:sz w:val="16"/>

</xml_diff>